<commit_message>
v2.6 - Adicionar texto de politicas nos 3 termos antes da assinatura
</commit_message>
<xml_diff>
--- a/public/devolucao.docx
+++ b/public/devolucao.docx
@@ -561,6 +561,42 @@
           <w:sz w:val="28"/>
           <w:szCs w:val="28"/>
         </w:rPr>
+      </w:r>
+    </w:p>
+    <w:p xmlns:w="http://schemas.openxmlformats.org/wordprocessingml/2006/main">
+      <w:pPr>
+        <w:jc w:val="left"/>
+      </w:pPr>
+      <w:r>
+        <w:rPr>
+          <w:sz w:val="28"/>
+          <w:szCs w:val="28"/>
+        </w:rPr>
+        <w:t xml:space="preserve">Devendo utilizá-lo conforme diretrizes estabelecidas nas políticas:</w:t>
+      </w:r>
+    </w:p>
+    <w:p xmlns:w="http://schemas.openxmlformats.org/wordprocessingml/2006/main">
+      <w:pPr>
+        <w:jc w:val="left"/>
+      </w:pPr>
+      <w:r>
+        <w:rPr>
+          <w:sz w:val="28"/>
+          <w:szCs w:val="28"/>
+        </w:rPr>
+        <w:t xml:space="preserve">Uso Seguro de Dispositivos Móveis</w:t>
+      </w:r>
+    </w:p>
+    <w:p xmlns:w="http://schemas.openxmlformats.org/wordprocessingml/2006/main">
+      <w:pPr>
+        <w:jc w:val="left"/>
+      </w:pPr>
+      <w:r>
+        <w:rPr>
+          <w:sz w:val="28"/>
+          <w:szCs w:val="28"/>
+        </w:rPr>
+        <w:t xml:space="preserve">Disponibilização de Equipamentos de TI</w:t>
       </w:r>
     </w:p>
     <w:p>

</xml_diff>

<commit_message>
v2.7 - Adicionar linha em branco entre texto de politicas e a data
</commit_message>
<xml_diff>
--- a/public/devolucao.docx
+++ b/public/devolucao.docx
@@ -1,116 +1,72 @@
 
 <file path=word/document.xml><?xml version="1.0" encoding="utf-8"?>
-<w:document xmlns:o="urn:schemas-microsoft-com:office:office" xmlns:r="http://schemas.openxmlformats.org/officeDocument/2006/relationships" xmlns:v="urn:schemas-microsoft-com:vml" xmlns:w="http://schemas.openxmlformats.org/wordprocessingml/2006/main" xmlns:w10="urn:schemas-microsoft-com:office:word" xmlns:wp="http://schemas.openxmlformats.org/drawingml/2006/wordprocessingDrawing" xmlns:pic="http://schemas.openxmlformats.org/drawingml/2006/picture" xmlns:wps="http://schemas.microsoft.com/office/word/2010/wordprocessingShape" xmlns:wpg="http://schemas.microsoft.com/office/word/2010/wordprocessingGroup" xmlns:mc="http://schemas.openxmlformats.org/markup-compatibility/2006" xmlns:wp14="http://schemas.microsoft.com/office/word/2010/wordprocessingDrawing" xmlns:w14="http://schemas.microsoft.com/office/word/2010/wordml" xmlns:w15="http://schemas.microsoft.com/office/word/2012/wordml" mc:Ignorable="w14 wp14 w15">
+<w:document xmlns:wpc="http://schemas.microsoft.com/office/word/2010/wordprocessingCanvas" xmlns:cx="http://schemas.microsoft.com/office/drawing/2014/chartex" xmlns:cx1="http://schemas.microsoft.com/office/drawing/2015/9/8/chartex" xmlns:cx2="http://schemas.microsoft.com/office/drawing/2015/10/21/chartex" xmlns:cx3="http://schemas.microsoft.com/office/drawing/2016/5/9/chartex" xmlns:cx4="http://schemas.microsoft.com/office/drawing/2016/5/10/chartex" xmlns:cx5="http://schemas.microsoft.com/office/drawing/2016/5/11/chartex" xmlns:cx6="http://schemas.microsoft.com/office/drawing/2016/5/12/chartex" xmlns:cx7="http://schemas.microsoft.com/office/drawing/2016/5/13/chartex" xmlns:cx8="http://schemas.microsoft.com/office/drawing/2016/5/14/chartex" xmlns:mc="http://schemas.openxmlformats.org/markup-compatibility/2006" xmlns:aink="http://schemas.microsoft.com/office/drawing/2016/ink" xmlns:am3d="http://schemas.microsoft.com/office/drawing/2017/model3d" xmlns:o="urn:schemas-microsoft-com:office:office" xmlns:oel="http://schemas.microsoft.com/office/2019/extlst" xmlns:r="http://schemas.openxmlformats.org/officeDocument/2006/relationships" xmlns:m="http://schemas.openxmlformats.org/officeDocument/2006/math" xmlns:v="urn:schemas-microsoft-com:vml" xmlns:wp14="http://schemas.microsoft.com/office/word/2010/wordprocessingDrawing" xmlns:wp="http://schemas.openxmlformats.org/drawingml/2006/wordprocessingDrawing" xmlns:w10="urn:schemas-microsoft-com:office:word" xmlns:w="http://schemas.openxmlformats.org/wordprocessingml/2006/main" xmlns:w14="http://schemas.microsoft.com/office/word/2010/wordml" xmlns:w15="http://schemas.microsoft.com/office/word/2012/wordml" xmlns:w16cex="http://schemas.microsoft.com/office/word/2018/wordml/cex" xmlns:w16cid="http://schemas.microsoft.com/office/word/2016/wordml/cid" xmlns:w16="http://schemas.microsoft.com/office/word/2018/wordml" xmlns:w16du="http://schemas.microsoft.com/office/word/2023/wordml/word16du" xmlns:w16sdtdh="http://schemas.microsoft.com/office/word/2020/wordml/sdtdatahash" xmlns:w16sdtfl="http://schemas.microsoft.com/office/word/2024/wordml/sdtformatlock" xmlns:w16se="http://schemas.microsoft.com/office/word/2015/wordml/symex" xmlns:wpg="http://schemas.microsoft.com/office/word/2010/wordprocessingGroup" xmlns:wpi="http://schemas.microsoft.com/office/word/2010/wordprocessingInk" xmlns:wne="http://schemas.microsoft.com/office/word/2006/wordml" xmlns:wps="http://schemas.microsoft.com/office/word/2010/wordprocessingShape" mc:Ignorable="w14 w15 w16se w16cid w16 w16cex w16sdtdh w16sdtfl w16du wp14">
   <w:body>
     <w:p>
       <w:pPr>
         <w:pStyle w:val="Standard1"/>
         <w:jc w:val="center"/>
-        <w:rPr/>
-      </w:pPr>
-      <w:r>
-        <w:rPr/>
-      </w:r>
+      </w:pPr>
     </w:p>
     <w:p>
       <w:pPr>
         <w:pStyle w:val="Standard1"/>
         <w:jc w:val="center"/>
-        <w:rPr/>
-      </w:pPr>
-      <w:r>
-        <w:rPr/>
-      </w:r>
+      </w:pPr>
     </w:p>
     <w:p>
       <w:pPr>
         <w:pStyle w:val="Standard1"/>
         <w:jc w:val="center"/>
-        <w:rPr/>
-      </w:pPr>
-      <w:r>
-        <w:rPr/>
-      </w:r>
+      </w:pPr>
     </w:p>
     <w:p>
       <w:pPr>
         <w:pStyle w:val="Standard1"/>
         <w:jc w:val="center"/>
-        <w:rPr/>
-      </w:pPr>
-      <w:r>
-        <w:rPr/>
-      </w:r>
+      </w:pPr>
     </w:p>
     <w:p>
       <w:pPr>
         <w:pStyle w:val="Standard1"/>
         <w:jc w:val="center"/>
-        <w:rPr/>
-      </w:pPr>
-      <w:r>
-        <w:rPr/>
-      </w:r>
+      </w:pPr>
     </w:p>
     <w:p>
       <w:pPr>
         <w:pStyle w:val="Standard1"/>
         <w:jc w:val="center"/>
-        <w:rPr/>
-      </w:pPr>
-      <w:r>
-        <w:rPr/>
-      </w:r>
+      </w:pPr>
     </w:p>
     <w:p>
       <w:pPr>
         <w:pStyle w:val="Standard1"/>
         <w:jc w:val="center"/>
-        <w:rPr/>
-      </w:pPr>
-      <w:r>
-        <w:rPr/>
-      </w:r>
+      </w:pPr>
     </w:p>
     <w:p>
       <w:pPr>
         <w:pStyle w:val="Standard1"/>
         <w:jc w:val="center"/>
-        <w:rPr/>
-      </w:pPr>
-      <w:r>
-        <w:rPr/>
-      </w:r>
+      </w:pPr>
     </w:p>
     <w:p>
       <w:pPr>
         <w:pStyle w:val="Standard1"/>
         <w:jc w:val="center"/>
-        <w:rPr/>
-      </w:pPr>
-      <w:r>
-        <w:rPr/>
-      </w:r>
+      </w:pPr>
     </w:p>
     <w:p>
       <w:pPr>
         <w:pStyle w:val="Standard1"/>
         <w:jc w:val="center"/>
-        <w:rPr/>
-      </w:pPr>
-      <w:r>
-        <w:rPr/>
-      </w:r>
+      </w:pPr>
     </w:p>
     <w:p>
       <w:pPr>
         <w:pStyle w:val="Standard1"/>
         <w:jc w:val="center"/>
-        <w:rPr/>
-      </w:pPr>
-      <w:r>
-        <w:rPr/>
-      </w:r>
+      </w:pPr>
     </w:p>
     <w:p>
       <w:pPr>
@@ -124,9 +80,11 @@
         </w:rPr>
       </w:pPr>
       <w:r>
-        <w:rPr/>
+        <w:rPr>
+          <w:noProof/>
+        </w:rPr>
         <w:drawing>
-          <wp:inline distT="0" distB="0" distL="0" distR="0">
+          <wp:inline distT="0" distB="0" distL="0" distR="0" wp14:anchorId="12F95DED" wp14:editId="039517A8">
             <wp:extent cx="2561590" cy="1866900"/>
             <wp:effectExtent l="0" t="0" r="0" b="0"/>
             <wp:docPr id="1" name="Imagem 1" descr="Logotipo&#10;&#10;Descrição gerada automaticamente"/>
@@ -143,7 +101,7 @@
                     </pic:cNvPicPr>
                   </pic:nvPicPr>
                   <pic:blipFill>
-                    <a:blip r:embed="rId2"/>
+                    <a:blip r:embed="rId8"/>
                     <a:stretch>
                       <a:fillRect/>
                     </a:stretch>
@@ -199,13 +157,9 @@
       <w:pPr>
         <w:pStyle w:val="Standard1"/>
         <w:jc w:val="center"/>
-        <w:rPr>
-          <w:rFonts w:ascii="Times New Roman" w:hAnsi="Times New Roman"/>
-        </w:rPr>
-      </w:pPr>
-      <w:r>
-        <w:rPr>
-          <w:rFonts w:ascii="Times New Roman" w:hAnsi="Times New Roman"/>
+      </w:pPr>
+      <w:r>
+        <w:rPr>
           <w:b/>
           <w:bCs/>
           <w:sz w:val="30"/>
@@ -218,43 +172,24 @@
       <w:pPr>
         <w:pStyle w:val="Standard1"/>
         <w:rPr>
-          <w:rFonts w:ascii="Times New Roman" w:hAnsi="Times New Roman"/>
-          <w:color w:val="000000"/>
-          <w:sz w:val="28"/>
-          <w:szCs w:val="28"/>
-        </w:rPr>
-      </w:pPr>
-      <w:r>
-        <w:rPr>
-          <w:rFonts w:ascii="Times New Roman" w:hAnsi="Times New Roman"/>
-          <w:color w:val="000000"/>
-          <w:sz w:val="28"/>
-          <w:szCs w:val="28"/>
-        </w:rPr>
-      </w:r>
-    </w:p>
-    <w:p>
-      <w:pPr>
-        <w:pStyle w:val="Standard1"/>
-        <w:rPr>
-          <w:rFonts w:ascii="Times New Roman" w:hAnsi="Times New Roman"/>
-          <w:color w:val="000000"/>
-          <w:sz w:val="28"/>
-          <w:szCs w:val="28"/>
-        </w:rPr>
-      </w:pPr>
-      <w:r>
-        <w:rPr>
-          <w:rFonts w:ascii="Times New Roman" w:hAnsi="Times New Roman"/>
-          <w:color w:val="000000"/>
-          <w:sz w:val="28"/>
-          <w:szCs w:val="28"/>
-        </w:rPr>
-      </w:r>
-    </w:p>
-    <w:p>
-      <w:pPr>
-        <w:pStyle w:val="Normal"/>
+          <w:color w:val="000000"/>
+          <w:sz w:val="28"/>
+          <w:szCs w:val="28"/>
+        </w:rPr>
+      </w:pPr>
+    </w:p>
+    <w:p>
+      <w:pPr>
+        <w:pStyle w:val="Standard1"/>
+        <w:rPr>
+          <w:color w:val="000000"/>
+          <w:sz w:val="28"/>
+          <w:szCs w:val="28"/>
+        </w:rPr>
+      </w:pPr>
+    </w:p>
+    <w:p>
+      <w:pPr>
         <w:rPr>
           <w:rFonts w:ascii="Times New Roman" w:hAnsi="Times New Roman"/>
         </w:rPr>
@@ -279,6 +214,7 @@
         </w:rPr>
         <w:t xml:space="preserve">: </w:t>
       </w:r>
+      <w:proofErr w:type="gramStart"/>
       <w:r>
         <w:rPr>
           <w:rFonts w:ascii="Times New Roman" w:hAnsi="Times New Roman"/>
@@ -286,7 +222,17 @@
           <w:sz w:val="28"/>
           <w:szCs w:val="28"/>
         </w:rPr>
-        <w:t>Matricula:</w:t>
+        <w:t>Matricula</w:t>
+      </w:r>
+      <w:proofErr w:type="gramEnd"/>
+      <w:r>
+        <w:rPr>
+          <w:rFonts w:ascii="Times New Roman" w:hAnsi="Times New Roman"/>
+          <w:color w:val="000000"/>
+          <w:sz w:val="28"/>
+          <w:szCs w:val="28"/>
+        </w:rPr>
+        <w:t>:</w:t>
       </w:r>
       <w:r>
         <w:rPr>
@@ -296,32 +242,39 @@
           <w:color w:val="000000"/>
           <w:sz w:val="20"/>
           <w:szCs w:val="20"/>
-          <w:shd w:fill="FFFFFF" w:val="clear"/>
+          <w:shd w:val="clear" w:color="auto" w:fill="FFFFFF"/>
         </w:rPr>
         <w:t xml:space="preserve"> </w:t>
       </w:r>
       <w:r>
         <w:rPr>
           <w:rFonts w:ascii="Times New Roman" w:hAnsi="Times New Roman"/>
-          <w:b w:val="false"/>
-          <w:bCs w:val="false"/>
-          <w:color w:val="000000"/>
-          <w:sz w:val="28"/>
-          <w:szCs w:val="28"/>
-          <w:shd w:fill="FFFFFF" w:val="clear"/>
+          <w:color w:val="000000"/>
+          <w:sz w:val="28"/>
+          <w:szCs w:val="28"/>
+          <w:shd w:val="clear" w:color="auto" w:fill="FFFFFF"/>
         </w:rPr>
         <w:t>{</w:t>
       </w:r>
+      <w:proofErr w:type="gramStart"/>
       <w:r>
         <w:rPr>
           <w:rFonts w:ascii="Times New Roman" w:hAnsi="Times New Roman"/>
-          <w:b w:val="false"/>
-          <w:bCs w:val="false"/>
-          <w:color w:val="000000"/>
-          <w:sz w:val="28"/>
-          <w:szCs w:val="28"/>
-        </w:rPr>
-        <w:t>MATRICULA}</w:t>
+          <w:color w:val="000000"/>
+          <w:sz w:val="28"/>
+          <w:szCs w:val="28"/>
+        </w:rPr>
+        <w:t>MATRICULA</w:t>
+      </w:r>
+      <w:proofErr w:type="gramEnd"/>
+      <w:r>
+        <w:rPr>
+          <w:rFonts w:ascii="Times New Roman" w:hAnsi="Times New Roman"/>
+          <w:color w:val="000000"/>
+          <w:sz w:val="28"/>
+          <w:szCs w:val="28"/>
+        </w:rPr>
+        <w:t>}</w:t>
       </w:r>
       <w:r>
         <w:rPr>
@@ -348,39 +301,21 @@
       <w:pPr>
         <w:pStyle w:val="Standard"/>
         <w:rPr>
-          <w:rFonts w:ascii="Times New Roman" w:hAnsi="Times New Roman"/>
-          <w:color w:val="000000"/>
-          <w:sz w:val="28"/>
-          <w:szCs w:val="28"/>
-        </w:rPr>
-      </w:pPr>
-      <w:r>
-        <w:rPr>
-          <w:rFonts w:ascii="Times New Roman" w:hAnsi="Times New Roman"/>
-          <w:color w:val="000000"/>
-          <w:sz w:val="28"/>
-          <w:szCs w:val="28"/>
-        </w:rPr>
-      </w:r>
-    </w:p>
-    <w:p>
-      <w:pPr>
-        <w:pStyle w:val="Standard1"/>
-        <w:rPr>
-          <w:rFonts w:ascii="Times New Roman" w:hAnsi="Times New Roman"/>
-          <w:color w:val="000000"/>
-          <w:sz w:val="28"/>
-          <w:szCs w:val="28"/>
-        </w:rPr>
-      </w:pPr>
-      <w:r>
-        <w:rPr>
-          <w:rFonts w:ascii="Times New Roman" w:hAnsi="Times New Roman"/>
-          <w:color w:val="000000"/>
-          <w:sz w:val="28"/>
-          <w:szCs w:val="28"/>
-        </w:rPr>
-      </w:r>
+          <w:color w:val="000000"/>
+          <w:sz w:val="28"/>
+          <w:szCs w:val="28"/>
+        </w:rPr>
+      </w:pPr>
+    </w:p>
+    <w:p>
+      <w:pPr>
+        <w:pStyle w:val="Standard1"/>
+        <w:rPr>
+          <w:color w:val="000000"/>
+          <w:sz w:val="28"/>
+          <w:szCs w:val="28"/>
+        </w:rPr>
+      </w:pPr>
     </w:p>
     <w:p>
       <w:pPr>
@@ -389,13 +324,9 @@
           <w:ilvl w:val="0"/>
           <w:numId w:val="1"/>
         </w:numPr>
-        <w:rPr>
-          <w:rFonts w:ascii="Times New Roman" w:hAnsi="Times New Roman"/>
-        </w:rPr>
-      </w:pPr>
-      <w:r>
-        <w:rPr>
-          <w:rFonts w:ascii="Times New Roman" w:hAnsi="Times New Roman"/>
+      </w:pPr>
+      <w:r>
+        <w:rPr>
           <w:color w:val="000000"/>
           <w:sz w:val="28"/>
           <w:szCs w:val="28"/>
@@ -410,13 +341,9 @@
           <w:ilvl w:val="0"/>
           <w:numId w:val="1"/>
         </w:numPr>
-        <w:rPr>
-          <w:rFonts w:ascii="Times New Roman" w:hAnsi="Times New Roman"/>
-        </w:rPr>
-      </w:pPr>
-      <w:r>
-        <w:rPr>
-          <w:rFonts w:ascii="Times New Roman" w:hAnsi="Times New Roman"/>
+      </w:pPr>
+      <w:r>
+        <w:rPr>
           <w:color w:val="000000"/>
           <w:sz w:val="28"/>
           <w:szCs w:val="28"/>
@@ -431,13 +358,9 @@
           <w:ilvl w:val="0"/>
           <w:numId w:val="1"/>
         </w:numPr>
-        <w:rPr>
-          <w:rFonts w:ascii="Times New Roman" w:hAnsi="Times New Roman"/>
-        </w:rPr>
-      </w:pPr>
-      <w:r>
-        <w:rPr>
-          <w:rFonts w:ascii="Times New Roman" w:hAnsi="Times New Roman"/>
+      </w:pPr>
+      <w:r>
+        <w:rPr>
           <w:color w:val="000000"/>
           <w:sz w:val="28"/>
           <w:szCs w:val="28"/>
@@ -452,164 +375,143 @@
           <w:ilvl w:val="0"/>
           <w:numId w:val="1"/>
         </w:numPr>
-        <w:rPr>
-          <w:rFonts w:ascii="Times New Roman" w:hAnsi="Times New Roman"/>
-        </w:rPr>
-      </w:pPr>
-      <w:r>
-        <w:rPr>
-          <w:rFonts w:ascii="Times New Roman" w:hAnsi="Times New Roman"/>
-          <w:color w:val="000000"/>
-          <w:sz w:val="28"/>
-          <w:szCs w:val="28"/>
-        </w:rPr>
-        <w:t>Serial number:</w:t>
-      </w:r>
-      <w:r>
-        <w:rPr>
-          <w:rFonts w:eastAsia="NSimSun" w:cs="Lucida Sans" w:ascii="Times New Roman" w:hAnsi="Times New Roman"/>
+      </w:pPr>
+      <w:r>
+        <w:rPr>
+          <w:color w:val="000000"/>
+          <w:sz w:val="28"/>
+          <w:szCs w:val="28"/>
+        </w:rPr>
+        <w:t xml:space="preserve">Serial </w:t>
+      </w:r>
+      <w:proofErr w:type="spellStart"/>
+      <w:r>
+        <w:rPr>
+          <w:color w:val="000000"/>
+          <w:sz w:val="28"/>
+          <w:szCs w:val="28"/>
+        </w:rPr>
+        <w:t>number</w:t>
+      </w:r>
+      <w:proofErr w:type="spellEnd"/>
+      <w:r>
+        <w:rPr>
+          <w:color w:val="000000"/>
+          <w:sz w:val="28"/>
+          <w:szCs w:val="28"/>
+        </w:rPr>
+        <w:t>:</w:t>
+      </w:r>
+      <w:r>
+        <w:rPr>
+          <w:rFonts w:eastAsia="NSimSun" w:cs="Lucida Sans"/>
           <w:color w:val="000000"/>
           <w:sz w:val="20"/>
           <w:szCs w:val="20"/>
-          <w:shd w:fill="FFFFFF" w:val="clear"/>
+          <w:shd w:val="clear" w:color="auto" w:fill="FFFFFF"/>
         </w:rPr>
         <w:t xml:space="preserve"> {</w:t>
       </w:r>
-      <w:r>
-        <w:rPr>
-          <w:rFonts w:ascii="Times New Roman" w:hAnsi="Times New Roman"/>
-          <w:color w:val="000000"/>
-          <w:sz w:val="28"/>
-          <w:szCs w:val="28"/>
-        </w:rPr>
-        <w:t>NUMERO_SERIE}</w:t>
-      </w:r>
-    </w:p>
-    <w:p>
-      <w:pPr>
-        <w:pStyle w:val="Standard1"/>
-        <w:rPr>
-          <w:rFonts w:ascii="Times New Roman" w:hAnsi="Times New Roman"/>
-          <w:color w:val="000000"/>
-          <w:sz w:val="28"/>
-          <w:szCs w:val="28"/>
-        </w:rPr>
-      </w:pPr>
-      <w:r>
-        <w:rPr>
-          <w:rFonts w:ascii="Times New Roman" w:hAnsi="Times New Roman"/>
-          <w:color w:val="000000"/>
-          <w:sz w:val="28"/>
-          <w:szCs w:val="28"/>
-        </w:rPr>
-      </w:r>
-    </w:p>
-    <w:p>
-      <w:pPr>
-        <w:pStyle w:val="Standard1"/>
-        <w:rPr>
-          <w:rFonts w:ascii="Times New Roman" w:hAnsi="Times New Roman"/>
-          <w:color w:val="000000"/>
-          <w:sz w:val="28"/>
-          <w:szCs w:val="28"/>
-        </w:rPr>
-      </w:pPr>
-      <w:r>
-        <w:rPr>
-          <w:rFonts w:ascii="Times New Roman" w:hAnsi="Times New Roman"/>
-          <w:color w:val="000000"/>
-          <w:sz w:val="28"/>
-          <w:szCs w:val="28"/>
-        </w:rPr>
-      </w:r>
-    </w:p>
-    <w:p>
-      <w:pPr>
-        <w:pStyle w:val="Standard1"/>
-        <w:jc w:val="both"/>
-        <w:rPr>
-          <w:rFonts w:ascii="Times New Roman" w:hAnsi="Times New Roman"/>
-          <w:color w:val="000000"/>
-          <w:sz w:val="28"/>
-          <w:szCs w:val="28"/>
-        </w:rPr>
-      </w:pPr>
-      <w:r>
-        <w:rPr>
-          <w:rFonts w:ascii="Times New Roman" w:hAnsi="Times New Roman"/>
-          <w:color w:val="000000"/>
-          <w:sz w:val="28"/>
-          <w:szCs w:val="28"/>
-        </w:rPr>
-      </w:r>
-    </w:p>
-    <w:p>
-      <w:pPr>
-        <w:pStyle w:val="Standard1"/>
-        <w:jc w:val="both"/>
-        <w:rPr>
-          <w:rFonts w:ascii="Times New Roman" w:hAnsi="Times New Roman"/>
-          <w:color w:val="000000"/>
-          <w:sz w:val="28"/>
-          <w:szCs w:val="28"/>
-        </w:rPr>
-      </w:pPr>
-      <w:r>
-        <w:rPr>
-          <w:rFonts w:ascii="Times New Roman" w:hAnsi="Times New Roman"/>
-          <w:color w:val="000000"/>
-          <w:sz w:val="28"/>
-          <w:szCs w:val="28"/>
-        </w:rPr>
-      </w:r>
-    </w:p>
-    <w:p xmlns:w="http://schemas.openxmlformats.org/wordprocessingml/2006/main">
-      <w:pPr>
-        <w:jc w:val="left"/>
-      </w:pPr>
-      <w:r>
-        <w:rPr>
-          <w:sz w:val="28"/>
-          <w:szCs w:val="28"/>
-        </w:rPr>
-        <w:t xml:space="preserve">Devendo utilizá-lo conforme diretrizes estabelecidas nas políticas:</w:t>
-      </w:r>
-    </w:p>
-    <w:p xmlns:w="http://schemas.openxmlformats.org/wordprocessingml/2006/main">
-      <w:pPr>
-        <w:jc w:val="left"/>
-      </w:pPr>
-      <w:r>
-        <w:rPr>
-          <w:sz w:val="28"/>
-          <w:szCs w:val="28"/>
-        </w:rPr>
-        <w:t xml:space="preserve">Uso Seguro de Dispositivos Móveis</w:t>
-      </w:r>
-    </w:p>
-    <w:p xmlns:w="http://schemas.openxmlformats.org/wordprocessingml/2006/main">
-      <w:pPr>
-        <w:jc w:val="left"/>
-      </w:pPr>
-      <w:r>
-        <w:rPr>
-          <w:sz w:val="28"/>
-          <w:szCs w:val="28"/>
-        </w:rPr>
-        <w:t xml:space="preserve">Disponibilização de Equipamentos de TI</w:t>
-      </w:r>
-    </w:p>
+      <w:proofErr w:type="gramStart"/>
+      <w:r>
+        <w:rPr>
+          <w:color w:val="000000"/>
+          <w:sz w:val="28"/>
+          <w:szCs w:val="28"/>
+        </w:rPr>
+        <w:t>NUMERO</w:t>
+      </w:r>
+      <w:proofErr w:type="gramEnd"/>
+      <w:r>
+        <w:rPr>
+          <w:color w:val="000000"/>
+          <w:sz w:val="28"/>
+          <w:szCs w:val="28"/>
+        </w:rPr>
+        <w:t>_SERIE}</w:t>
+      </w:r>
+    </w:p>
+    <w:p>
+      <w:pPr>
+        <w:pStyle w:val="Standard1"/>
+        <w:rPr>
+          <w:color w:val="000000"/>
+          <w:sz w:val="28"/>
+          <w:szCs w:val="28"/>
+        </w:rPr>
+      </w:pPr>
+    </w:p>
+    <w:p>
+      <w:pPr>
+        <w:pStyle w:val="Standard1"/>
+        <w:rPr>
+          <w:color w:val="000000"/>
+          <w:sz w:val="28"/>
+          <w:szCs w:val="28"/>
+        </w:rPr>
+      </w:pPr>
+    </w:p>
+    <w:p>
+      <w:r>
+        <w:rPr>
+          <w:sz w:val="28"/>
+          <w:szCs w:val="28"/>
+        </w:rPr>
+        <w:t>Devendo utilizá-lo conforme diretrizes estabelecidas nas políticas:</w:t>
+      </w:r>
+    </w:p>
+    <w:p>
+      <w:pPr>
+        <w:pStyle w:val="PargrafodaLista"/>
+        <w:numPr>
+          <w:ilvl w:val="0"/>
+          <w:numId w:val="3"/>
+        </w:numPr>
+      </w:pPr>
+      <w:r>
+        <w:rPr>
+          <w:sz w:val="28"/>
+          <w:szCs w:val="28"/>
+        </w:rPr>
+        <w:t>Uso Seguro de Dispositivos Móveis</w:t>
+      </w:r>
+    </w:p>
+    <w:p>
+      <w:pPr>
+        <w:pStyle w:val="PargrafodaLista"/>
+        <w:numPr>
+          <w:ilvl w:val="0"/>
+          <w:numId w:val="3"/>
+        </w:numPr>
+        <w:rPr>
+          <w:sz w:val="28"/>
+          <w:szCs w:val="28"/>
+        </w:rPr>
+      </w:pPr>
+      <w:r>
+        <w:rPr>
+          <w:sz w:val="28"/>
+          <w:szCs w:val="28"/>
+        </w:rPr>
+        <w:t>Disponibilização de Equipamentos de TI</w:t>
+      </w:r>
+    </w:p>
+    <w:p>
+      <w:pPr>
+        <w:rPr>
+          <w:sz w:val="28"/>
+          <w:szCs w:val="28"/>
+        </w:rPr>
+      </w:pPr>
+    </w:p>
+    <w:p/>
     <w:p>
       <w:pPr>
         <w:pStyle w:val="Standard1"/>
         <w:jc w:val="center"/>
-        <w:rPr>
-          <w:rFonts w:ascii="Times New Roman" w:hAnsi="Times New Roman"/>
-        </w:rPr>
-      </w:pPr>
-      <w:r>
-        <w:rPr>
-          <w:rFonts w:ascii="Times New Roman" w:hAnsi="Times New Roman"/>
+      </w:pPr>
+      <w:r>
+        <w:rPr>
           <w:color w:val="000000"/>
           <w:sz w:val="28"/>
           <w:szCs w:val="28"/>
@@ -619,7 +521,6 @@
       <w:bookmarkStart w:id="0" w:name="_Hlk45554307"/>
       <w:r>
         <w:rPr>
-          <w:rFonts w:ascii="Times New Roman" w:hAnsi="Times New Roman"/>
           <w:color w:val="000000"/>
           <w:sz w:val="28"/>
           <w:szCs w:val="28"/>
@@ -632,71 +533,40 @@
         <w:pStyle w:val="Standard1"/>
         <w:jc w:val="center"/>
         <w:rPr>
-          <w:rFonts w:ascii="Times New Roman" w:hAnsi="Times New Roman"/>
-          <w:color w:val="000000"/>
-          <w:sz w:val="28"/>
-          <w:szCs w:val="28"/>
-        </w:rPr>
-      </w:pPr>
-      <w:r>
-        <w:rPr>
-          <w:rFonts w:ascii="Times New Roman" w:hAnsi="Times New Roman"/>
-          <w:color w:val="000000"/>
-          <w:sz w:val="28"/>
-          <w:szCs w:val="28"/>
-        </w:rPr>
-      </w:r>
+          <w:color w:val="000000"/>
+          <w:sz w:val="28"/>
+          <w:szCs w:val="28"/>
+        </w:rPr>
+      </w:pPr>
     </w:p>
     <w:p>
       <w:pPr>
         <w:pStyle w:val="Standard1"/>
         <w:jc w:val="center"/>
         <w:rPr>
-          <w:rFonts w:ascii="Times New Roman" w:hAnsi="Times New Roman"/>
-          <w:color w:val="000000"/>
-          <w:sz w:val="28"/>
-          <w:szCs w:val="28"/>
-        </w:rPr>
-      </w:pPr>
-      <w:r>
-        <w:rPr>
-          <w:rFonts w:ascii="Times New Roman" w:hAnsi="Times New Roman"/>
-          <w:color w:val="000000"/>
-          <w:sz w:val="28"/>
-          <w:szCs w:val="28"/>
-        </w:rPr>
-      </w:r>
-    </w:p>
-    <w:p>
-      <w:pPr>
-        <w:pStyle w:val="Standard1"/>
-        <w:rPr>
-          <w:rFonts w:ascii="Times New Roman" w:hAnsi="Times New Roman"/>
-          <w:color w:val="000000"/>
-          <w:sz w:val="28"/>
-          <w:szCs w:val="28"/>
-        </w:rPr>
-      </w:pPr>
-      <w:r>
-        <w:rPr>
-          <w:rFonts w:ascii="Times New Roman" w:hAnsi="Times New Roman"/>
-          <w:color w:val="000000"/>
-          <w:sz w:val="28"/>
-          <w:szCs w:val="28"/>
-        </w:rPr>
-      </w:r>
+          <w:color w:val="000000"/>
+          <w:sz w:val="28"/>
+          <w:szCs w:val="28"/>
+        </w:rPr>
+      </w:pPr>
+    </w:p>
+    <w:p>
+      <w:pPr>
+        <w:pStyle w:val="Standard1"/>
+        <w:rPr>
+          <w:color w:val="000000"/>
+          <w:sz w:val="28"/>
+          <w:szCs w:val="28"/>
+        </w:rPr>
+      </w:pPr>
     </w:p>
     <w:p>
       <w:pPr>
         <w:pStyle w:val="Standard1"/>
         <w:jc w:val="center"/>
-        <w:rPr>
-          <w:rFonts w:ascii="Times New Roman" w:hAnsi="Times New Roman"/>
-        </w:rPr>
-      </w:pPr>
-      <w:r>
-        <w:rPr>
-          <w:rFonts w:ascii="Times New Roman" w:hAnsi="Times New Roman"/>
+      </w:pPr>
+      <w:r>
+        <w:rPr>
           <w:color w:val="000000"/>
           <w:sz w:val="28"/>
           <w:szCs w:val="28"/>
@@ -709,13 +579,9 @@
       <w:pPr>
         <w:pStyle w:val="Standard1"/>
         <w:jc w:val="center"/>
-        <w:rPr>
-          <w:rFonts w:ascii="Times New Roman" w:hAnsi="Times New Roman"/>
-        </w:rPr>
-      </w:pPr>
-      <w:r>
-        <w:rPr>
-          <w:rFonts w:ascii="Times New Roman" w:hAnsi="Times New Roman"/>
+      </w:pPr>
+      <w:r>
+        <w:rPr>
           <w:b/>
           <w:bCs/>
           <w:color w:val="000000"/>
@@ -726,48 +592,62 @@
       </w:r>
     </w:p>
     <w:sectPr>
-      <w:footerReference w:type="even" r:id="rId3"/>
-      <w:footerReference w:type="default" r:id="rId4"/>
-      <w:footerReference w:type="first" r:id="rId5"/>
-      <w:type w:val="nextPage"/>
+      <w:footerReference w:type="even" r:id="rId9"/>
+      <w:footerReference w:type="default" r:id="rId10"/>
+      <w:footerReference w:type="first" r:id="rId11"/>
       <w:pgSz w:w="11906" w:h="16838"/>
-      <w:pgMar w:left="1417" w:right="1417" w:gutter="0" w:header="0" w:top="426" w:footer="720" w:bottom="1134"/>
-      <w:pgNumType w:fmt="decimal"/>
-      <w:formProt w:val="false"/>
-      <w:textDirection w:val="lrTb"/>
-      <w:docGrid w:type="default" w:linePitch="100" w:charSpace="0"/>
+      <w:pgMar w:top="426" w:right="1417" w:bottom="1134" w:left="1417" w:header="0" w:footer="720" w:gutter="0"/>
+      <w:cols w:space="720"/>
+      <w:formProt w:val="0"/>
+      <w:docGrid w:linePitch="100"/>
     </w:sectPr>
   </w:body>
 </w:document>
 </file>
 
+<file path=word/endnotes.xml><?xml version="1.0" encoding="utf-8"?>
+<w:endnotes xmlns:wpc="http://schemas.microsoft.com/office/word/2010/wordprocessingCanvas" xmlns:cx="http://schemas.microsoft.com/office/drawing/2014/chartex" xmlns:cx1="http://schemas.microsoft.com/office/drawing/2015/9/8/chartex" xmlns:cx2="http://schemas.microsoft.com/office/drawing/2015/10/21/chartex" xmlns:cx3="http://schemas.microsoft.com/office/drawing/2016/5/9/chartex" xmlns:cx4="http://schemas.microsoft.com/office/drawing/2016/5/10/chartex" xmlns:cx5="http://schemas.microsoft.com/office/drawing/2016/5/11/chartex" xmlns:cx6="http://schemas.microsoft.com/office/drawing/2016/5/12/chartex" xmlns:cx7="http://schemas.microsoft.com/office/drawing/2016/5/13/chartex" xmlns:cx8="http://schemas.microsoft.com/office/drawing/2016/5/14/chartex" xmlns:mc="http://schemas.openxmlformats.org/markup-compatibility/2006" xmlns:aink="http://schemas.microsoft.com/office/drawing/2016/ink" xmlns:am3d="http://schemas.microsoft.com/office/drawing/2017/model3d" xmlns:o="urn:schemas-microsoft-com:office:office" xmlns:oel="http://schemas.microsoft.com/office/2019/extlst" xmlns:r="http://schemas.openxmlformats.org/officeDocument/2006/relationships" xmlns:m="http://schemas.openxmlformats.org/officeDocument/2006/math" xmlns:v="urn:schemas-microsoft-com:vml" xmlns:wp14="http://schemas.microsoft.com/office/word/2010/wordprocessingDrawing" xmlns:wp="http://schemas.openxmlformats.org/drawingml/2006/wordprocessingDrawing" xmlns:w10="urn:schemas-microsoft-com:office:word" xmlns:w="http://schemas.openxmlformats.org/wordprocessingml/2006/main" xmlns:w14="http://schemas.microsoft.com/office/word/2010/wordml" xmlns:w15="http://schemas.microsoft.com/office/word/2012/wordml" xmlns:w16cex="http://schemas.microsoft.com/office/word/2018/wordml/cex" xmlns:w16cid="http://schemas.microsoft.com/office/word/2016/wordml/cid" xmlns:w16="http://schemas.microsoft.com/office/word/2018/wordml" xmlns:w16du="http://schemas.microsoft.com/office/word/2023/wordml/word16du" xmlns:w16sdtdh="http://schemas.microsoft.com/office/word/2020/wordml/sdtdatahash" xmlns:w16sdtfl="http://schemas.microsoft.com/office/word/2024/wordml/sdtformatlock" xmlns:w16se="http://schemas.microsoft.com/office/word/2015/wordml/symex" xmlns:wpg="http://schemas.microsoft.com/office/word/2010/wordprocessingGroup" xmlns:wpi="http://schemas.microsoft.com/office/word/2010/wordprocessingInk" xmlns:wne="http://schemas.microsoft.com/office/word/2006/wordml" xmlns:wps="http://schemas.microsoft.com/office/word/2010/wordprocessingShape" mc:Ignorable="w14 w15 w16se w16cid w16 w16cex w16sdtdh w16sdtfl w16du wp14">
+  <w:endnote w:type="separator" w:id="-1">
+    <w:p>
+      <w:r>
+        <w:separator/>
+      </w:r>
+    </w:p>
+  </w:endnote>
+  <w:endnote w:type="continuationSeparator" w:id="0">
+    <w:p>
+      <w:r>
+        <w:continuationSeparator/>
+      </w:r>
+    </w:p>
+  </w:endnote>
+</w:endnotes>
+</file>
+
 <file path=word/footer1.xml><?xml version="1.0" encoding="utf-8"?>
-<w:ftr xmlns:o="urn:schemas-microsoft-com:office:office" xmlns:r="http://schemas.openxmlformats.org/officeDocument/2006/relationships" xmlns:v="urn:schemas-microsoft-com:vml" xmlns:w="http://schemas.openxmlformats.org/wordprocessingml/2006/main" xmlns:w10="urn:schemas-microsoft-com:office:word" xmlns:wp="http://schemas.openxmlformats.org/drawingml/2006/wordprocessingDrawing" xmlns:pic="http://schemas.openxmlformats.org/drawingml/2006/picture" xmlns:wps="http://schemas.microsoft.com/office/word/2010/wordprocessingShape" xmlns:wpg="http://schemas.microsoft.com/office/word/2010/wordprocessingGroup" xmlns:mc="http://schemas.openxmlformats.org/markup-compatibility/2006" xmlns:wp14="http://schemas.microsoft.com/office/word/2010/wordprocessingDrawing" xmlns:w14="http://schemas.microsoft.com/office/word/2010/wordml" xmlns:w15="http://schemas.microsoft.com/office/word/2012/wordml" mc:Ignorable="w14 wp14 w15">
+<w:ftr xmlns:wpc="http://schemas.microsoft.com/office/word/2010/wordprocessingCanvas" xmlns:cx="http://schemas.microsoft.com/office/drawing/2014/chartex" xmlns:cx1="http://schemas.microsoft.com/office/drawing/2015/9/8/chartex" xmlns:cx2="http://schemas.microsoft.com/office/drawing/2015/10/21/chartex" xmlns:cx3="http://schemas.microsoft.com/office/drawing/2016/5/9/chartex" xmlns:cx4="http://schemas.microsoft.com/office/drawing/2016/5/10/chartex" xmlns:cx5="http://schemas.microsoft.com/office/drawing/2016/5/11/chartex" xmlns:cx6="http://schemas.microsoft.com/office/drawing/2016/5/12/chartex" xmlns:cx7="http://schemas.microsoft.com/office/drawing/2016/5/13/chartex" xmlns:cx8="http://schemas.microsoft.com/office/drawing/2016/5/14/chartex" xmlns:mc="http://schemas.openxmlformats.org/markup-compatibility/2006" xmlns:aink="http://schemas.microsoft.com/office/drawing/2016/ink" xmlns:am3d="http://schemas.microsoft.com/office/drawing/2017/model3d" xmlns:o="urn:schemas-microsoft-com:office:office" xmlns:oel="http://schemas.microsoft.com/office/2019/extlst" xmlns:r="http://schemas.openxmlformats.org/officeDocument/2006/relationships" xmlns:m="http://schemas.openxmlformats.org/officeDocument/2006/math" xmlns:v="urn:schemas-microsoft-com:vml" xmlns:wp14="http://schemas.microsoft.com/office/word/2010/wordprocessingDrawing" xmlns:wp="http://schemas.openxmlformats.org/drawingml/2006/wordprocessingDrawing" xmlns:w10="urn:schemas-microsoft-com:office:word" xmlns:w="http://schemas.openxmlformats.org/wordprocessingml/2006/main" xmlns:w14="http://schemas.microsoft.com/office/word/2010/wordml" xmlns:w15="http://schemas.microsoft.com/office/word/2012/wordml" xmlns:w16cex="http://schemas.microsoft.com/office/word/2018/wordml/cex" xmlns:w16cid="http://schemas.microsoft.com/office/word/2016/wordml/cid" xmlns:w16="http://schemas.microsoft.com/office/word/2018/wordml" xmlns:w16du="http://schemas.microsoft.com/office/word/2023/wordml/word16du" xmlns:w16sdtdh="http://schemas.microsoft.com/office/word/2020/wordml/sdtdatahash" xmlns:w16sdtfl="http://schemas.microsoft.com/office/word/2024/wordml/sdtformatlock" xmlns:w16se="http://schemas.microsoft.com/office/word/2015/wordml/symex" xmlns:wpg="http://schemas.microsoft.com/office/word/2010/wordprocessingGroup" xmlns:wpi="http://schemas.microsoft.com/office/word/2010/wordprocessingInk" xmlns:wne="http://schemas.microsoft.com/office/word/2006/wordml" xmlns:wps="http://schemas.microsoft.com/office/word/2010/wordprocessingShape" mc:Ignorable="w14 w15 w16se w16cid w16 w16cex w16sdtdh w16sdtfl w16du wp14">
   <w:p>
     <w:pPr>
-      <w:pStyle w:val="Footer"/>
-      <w:rPr/>
+      <w:pStyle w:val="Rodap"/>
     </w:pPr>
-    <w:r>
-      <w:rPr/>
-    </w:r>
   </w:p>
 </w:ftr>
 </file>
 
 <file path=word/footer2.xml><?xml version="1.0" encoding="utf-8"?>
-<w:ftr xmlns:o="urn:schemas-microsoft-com:office:office" xmlns:r="http://schemas.openxmlformats.org/officeDocument/2006/relationships" xmlns:v="urn:schemas-microsoft-com:vml" xmlns:w="http://schemas.openxmlformats.org/wordprocessingml/2006/main" xmlns:w10="urn:schemas-microsoft-com:office:word" xmlns:wp="http://schemas.openxmlformats.org/drawingml/2006/wordprocessingDrawing" xmlns:pic="http://schemas.openxmlformats.org/drawingml/2006/picture" xmlns:wps="http://schemas.microsoft.com/office/word/2010/wordprocessingShape" xmlns:wpg="http://schemas.microsoft.com/office/word/2010/wordprocessingGroup" xmlns:mc="http://schemas.openxmlformats.org/markup-compatibility/2006" xmlns:wp14="http://schemas.microsoft.com/office/word/2010/wordprocessingDrawing" xmlns:w14="http://schemas.microsoft.com/office/word/2010/wordml" xmlns:w15="http://schemas.microsoft.com/office/word/2012/wordml" mc:Ignorable="w14 wp14 w15">
+<w:ftr xmlns:wpc="http://schemas.microsoft.com/office/word/2010/wordprocessingCanvas" xmlns:cx="http://schemas.microsoft.com/office/drawing/2014/chartex" xmlns:cx1="http://schemas.microsoft.com/office/drawing/2015/9/8/chartex" xmlns:cx2="http://schemas.microsoft.com/office/drawing/2015/10/21/chartex" xmlns:cx3="http://schemas.microsoft.com/office/drawing/2016/5/9/chartex" xmlns:cx4="http://schemas.microsoft.com/office/drawing/2016/5/10/chartex" xmlns:cx5="http://schemas.microsoft.com/office/drawing/2016/5/11/chartex" xmlns:cx6="http://schemas.microsoft.com/office/drawing/2016/5/12/chartex" xmlns:cx7="http://schemas.microsoft.com/office/drawing/2016/5/13/chartex" xmlns:cx8="http://schemas.microsoft.com/office/drawing/2016/5/14/chartex" xmlns:mc="http://schemas.openxmlformats.org/markup-compatibility/2006" xmlns:aink="http://schemas.microsoft.com/office/drawing/2016/ink" xmlns:am3d="http://schemas.microsoft.com/office/drawing/2017/model3d" xmlns:o="urn:schemas-microsoft-com:office:office" xmlns:oel="http://schemas.microsoft.com/office/2019/extlst" xmlns:r="http://schemas.openxmlformats.org/officeDocument/2006/relationships" xmlns:m="http://schemas.openxmlformats.org/officeDocument/2006/math" xmlns:v="urn:schemas-microsoft-com:vml" xmlns:wp14="http://schemas.microsoft.com/office/word/2010/wordprocessingDrawing" xmlns:wp="http://schemas.openxmlformats.org/drawingml/2006/wordprocessingDrawing" xmlns:w10="urn:schemas-microsoft-com:office:word" xmlns:w="http://schemas.openxmlformats.org/wordprocessingml/2006/main" xmlns:w14="http://schemas.microsoft.com/office/word/2010/wordml" xmlns:w15="http://schemas.microsoft.com/office/word/2012/wordml" xmlns:w16cex="http://schemas.microsoft.com/office/word/2018/wordml/cex" xmlns:w16cid="http://schemas.microsoft.com/office/word/2016/wordml/cid" xmlns:w16="http://schemas.microsoft.com/office/word/2018/wordml" xmlns:w16du="http://schemas.microsoft.com/office/word/2023/wordml/word16du" xmlns:w16sdtdh="http://schemas.microsoft.com/office/word/2020/wordml/sdtdatahash" xmlns:w16sdtfl="http://schemas.microsoft.com/office/word/2024/wordml/sdtformatlock" xmlns:w16se="http://schemas.microsoft.com/office/word/2015/wordml/symex" xmlns:wpg="http://schemas.microsoft.com/office/word/2010/wordprocessingGroup" xmlns:wpi="http://schemas.microsoft.com/office/word/2010/wordprocessingInk" xmlns:wne="http://schemas.microsoft.com/office/word/2006/wordml" xmlns:wps="http://schemas.microsoft.com/office/word/2010/wordprocessingShape" mc:Ignorable="w14 w15 w16se w16cid w16 w16cex w16sdtdh w16sdtfl w16du wp14">
   <w:p>
     <w:pPr>
-      <w:pStyle w:val="Footer"/>
-      <w:rPr/>
+      <w:pStyle w:val="Rodap"/>
     </w:pPr>
     <w:r>
-      <w:rPr/>
+      <w:rPr>
+        <w:noProof/>
+      </w:rPr>
       <mc:AlternateContent>
         <mc:Choice Requires="wps">
           <w:drawing>
-            <wp:anchor distT="0" distB="12700" distL="0" distR="0" simplePos="0" relativeHeight="3" behindDoc="1" locked="0" layoutInCell="0" allowOverlap="1" wp14:anchorId="54AA7281">
+            <wp:anchor distT="0" distB="12700" distL="0" distR="0" simplePos="0" relativeHeight="251657216" behindDoc="1" locked="0" layoutInCell="0" allowOverlap="1" wp14:anchorId="54AA7281" wp14:editId="3E9FE0F1">
               <wp:simplePos x="0" y="0"/>
               <wp:positionH relativeFrom="page">
                 <wp:posOffset>0</wp:posOffset>
@@ -779,6 +659,7 @@
               <wp:effectExtent l="0" t="0" r="0" b="12700"/>
               <wp:wrapNone/>
               <wp:docPr id="2" name="MSIPCMc4af449192361907e419e9b6" descr="{&quot;HashCode&quot;:501191150,&quot;Height&quot;:841.0,&quot;Width&quot;:595.0,&quot;Placement&quot;:&quot;Footer&quot;,&quot;Index&quot;:&quot;Primary&quot;,&quot;Section&quot;:1,&quot;Top&quot;:0.0,&quot;Left&quot;:0.0}"/>
+              <wp:cNvGraphicFramePr/>
               <a:graphic xmlns:a="http://schemas.openxmlformats.org/drawingml/2006/main">
                 <a:graphicData uri="http://schemas.microsoft.com/office/word/2010/wordprocessingShape">
                   <wps:wsp>
@@ -797,9 +678,15 @@
                       </a:ln>
                     </wps:spPr>
                     <wps:style>
-                      <a:lnRef idx="0"/>
-                      <a:fillRef idx="0"/>
-                      <a:effectRef idx="0"/>
+                      <a:lnRef idx="0">
+                        <a:scrgbClr r="0" g="0" b="0"/>
+                      </a:lnRef>
+                      <a:fillRef idx="0">
+                        <a:scrgbClr r="0" g="0" b="0"/>
+                      </a:fillRef>
+                      <a:effectRef idx="0">
+                        <a:scrgbClr r="0" g="0" b="0"/>
+                      </a:effectRef>
                       <a:fontRef idx="minor"/>
                     </wps:style>
                     <wps:txbx>
@@ -807,7 +694,7 @@
                         <w:p>
                           <w:pPr>
                             <w:pStyle w:val="Contedodoquadro"/>
-                            <w:jc w:val="end"/>
+                            <w:jc w:val="right"/>
                             <w:rPr>
                               <w:rFonts w:ascii="Calibri" w:hAnsi="Calibri" w:cs="Calibri"/>
                               <w:color w:val="000000"/>
@@ -816,17 +703,29 @@
                           </w:pPr>
                           <w:r>
                             <w:rPr>
-                              <w:rFonts w:cs="Calibri" w:ascii="Calibri" w:hAnsi="Calibri"/>
+                              <w:rFonts w:ascii="Calibri" w:hAnsi="Calibri" w:cs="Calibri"/>
                               <w:color w:val="000000"/>
                               <w:sz w:val="22"/>
                             </w:rPr>
-                            <w:t>Este conteúdo foi classificado como Interno</w:t>
+                            <w:t xml:space="preserve">Este conteúdo foi classificado </w:t>
                           </w:r>
+                          <w:proofErr w:type="gramStart"/>
+                          <w:r>
+                            <w:rPr>
+                              <w:rFonts w:ascii="Calibri" w:hAnsi="Calibri" w:cs="Calibri"/>
+                              <w:color w:val="000000"/>
+                              <w:sz w:val="22"/>
+                            </w:rPr>
+                            <w:t>como Interno</w:t>
+                          </w:r>
+                          <w:proofErr w:type="gramEnd"/>
                         </w:p>
                       </w:txbxContent>
                     </wps:txbx>
                     <wps:bodyPr tIns="0" rIns="254160" bIns="0" anchor="b">
-                      <a:prstTxWarp prst="textNoShape"/>
+                      <a:prstTxWarp prst="textNoShape">
+                        <a:avLst/>
+                      </a:prstTxWarp>
                       <a:noAutofit/>
                     </wps:bodyPr>
                   </wps:wsp>
@@ -837,15 +736,13 @@
         </mc:Choice>
         <mc:Fallback>
           <w:pict>
-            <v:rect id="shape_0" stroked="f" o:allowincell="f" style="position:absolute;margin-left:0pt;margin-top:805.35pt;width:595.25pt;height:21.45pt;mso-wrap-style:square;v-text-anchor:bottom;mso-position-horizontal-relative:page;mso-position-vertical-relative:page" wp14:anchorId="54AA7281">
-              <v:fill o:detectmouseclick="t" on="false"/>
-              <v:stroke color="#3465a4" weight="6480" joinstyle="round" endcap="flat"/>
-              <v:textbox>
+            <v:rect w14:anchorId="54AA7281" id="MSIPCMc4af449192361907e419e9b6" o:spid="_x0000_s1026" alt="{&quot;HashCode&quot;:501191150,&quot;Height&quot;:841.0,&quot;Width&quot;:595.0,&quot;Placement&quot;:&quot;Footer&quot;,&quot;Index&quot;:&quot;Primary&quot;,&quot;Section&quot;:1,&quot;Top&quot;:0.0,&quot;Left&quot;:0.0}" style="position:absolute;margin-left:0;margin-top:805.35pt;width:595.3pt;height:21.5pt;z-index:-251659264;visibility:visible;mso-wrap-style:square;mso-wrap-distance-left:0;mso-wrap-distance-top:0;mso-wrap-distance-right:0;mso-wrap-distance-bottom:1pt;mso-position-horizontal:absolute;mso-position-horizontal-relative:page;mso-position-vertical:absolute;mso-position-vertical-relative:page;v-text-anchor:bottom" o:gfxdata="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" o:allowincell="f" filled="f" stroked="f" strokeweight=".5pt">
+              <v:textbox inset=",0,7.06mm,0">
                 <w:txbxContent>
                   <w:p>
                     <w:pPr>
                       <w:pStyle w:val="Contedodoquadro"/>
-                      <w:jc w:val="end"/>
+                      <w:jc w:val="right"/>
                       <w:rPr>
                         <w:rFonts w:ascii="Calibri" w:hAnsi="Calibri" w:cs="Calibri"/>
                         <w:color w:val="000000"/>
@@ -854,16 +751,26 @@
                     </w:pPr>
                     <w:r>
                       <w:rPr>
-                        <w:rFonts w:cs="Calibri" w:ascii="Calibri" w:hAnsi="Calibri"/>
+                        <w:rFonts w:ascii="Calibri" w:hAnsi="Calibri" w:cs="Calibri"/>
                         <w:color w:val="000000"/>
                         <w:sz w:val="22"/>
                       </w:rPr>
-                      <w:t>Este conteúdo foi classificado como Interno</w:t>
+                      <w:t xml:space="preserve">Este conteúdo foi classificado </w:t>
                     </w:r>
+                    <w:proofErr w:type="gramStart"/>
+                    <w:r>
+                      <w:rPr>
+                        <w:rFonts w:ascii="Calibri" w:hAnsi="Calibri" w:cs="Calibri"/>
+                        <w:color w:val="000000"/>
+                        <w:sz w:val="22"/>
+                      </w:rPr>
+                      <w:t>como Interno</w:t>
+                    </w:r>
+                    <w:proofErr w:type="gramEnd"/>
                   </w:p>
                 </w:txbxContent>
               </v:textbox>
-              <w10:wrap type="none"/>
+              <w10:wrap anchorx="page" anchory="page"/>
             </v:rect>
           </w:pict>
         </mc:Fallback>
@@ -874,18 +781,19 @@
 </file>
 
 <file path=word/footer3.xml><?xml version="1.0" encoding="utf-8"?>
-<w:ftr xmlns:o="urn:schemas-microsoft-com:office:office" xmlns:r="http://schemas.openxmlformats.org/officeDocument/2006/relationships" xmlns:v="urn:schemas-microsoft-com:vml" xmlns:w="http://schemas.openxmlformats.org/wordprocessingml/2006/main" xmlns:w10="urn:schemas-microsoft-com:office:word" xmlns:wp="http://schemas.openxmlformats.org/drawingml/2006/wordprocessingDrawing" xmlns:pic="http://schemas.openxmlformats.org/drawingml/2006/picture" xmlns:wps="http://schemas.microsoft.com/office/word/2010/wordprocessingShape" xmlns:wpg="http://schemas.microsoft.com/office/word/2010/wordprocessingGroup" xmlns:mc="http://schemas.openxmlformats.org/markup-compatibility/2006" xmlns:wp14="http://schemas.microsoft.com/office/word/2010/wordprocessingDrawing" xmlns:w14="http://schemas.microsoft.com/office/word/2010/wordml" xmlns:w15="http://schemas.microsoft.com/office/word/2012/wordml" mc:Ignorable="w14 wp14 w15">
+<w:ftr xmlns:wpc="http://schemas.microsoft.com/office/word/2010/wordprocessingCanvas" xmlns:cx="http://schemas.microsoft.com/office/drawing/2014/chartex" xmlns:cx1="http://schemas.microsoft.com/office/drawing/2015/9/8/chartex" xmlns:cx2="http://schemas.microsoft.com/office/drawing/2015/10/21/chartex" xmlns:cx3="http://schemas.microsoft.com/office/drawing/2016/5/9/chartex" xmlns:cx4="http://schemas.microsoft.com/office/drawing/2016/5/10/chartex" xmlns:cx5="http://schemas.microsoft.com/office/drawing/2016/5/11/chartex" xmlns:cx6="http://schemas.microsoft.com/office/drawing/2016/5/12/chartex" xmlns:cx7="http://schemas.microsoft.com/office/drawing/2016/5/13/chartex" xmlns:cx8="http://schemas.microsoft.com/office/drawing/2016/5/14/chartex" xmlns:mc="http://schemas.openxmlformats.org/markup-compatibility/2006" xmlns:aink="http://schemas.microsoft.com/office/drawing/2016/ink" xmlns:am3d="http://schemas.microsoft.com/office/drawing/2017/model3d" xmlns:o="urn:schemas-microsoft-com:office:office" xmlns:oel="http://schemas.microsoft.com/office/2019/extlst" xmlns:r="http://schemas.openxmlformats.org/officeDocument/2006/relationships" xmlns:m="http://schemas.openxmlformats.org/officeDocument/2006/math" xmlns:v="urn:schemas-microsoft-com:vml" xmlns:wp14="http://schemas.microsoft.com/office/word/2010/wordprocessingDrawing" xmlns:wp="http://schemas.openxmlformats.org/drawingml/2006/wordprocessingDrawing" xmlns:w10="urn:schemas-microsoft-com:office:word" xmlns:w="http://schemas.openxmlformats.org/wordprocessingml/2006/main" xmlns:w14="http://schemas.microsoft.com/office/word/2010/wordml" xmlns:w15="http://schemas.microsoft.com/office/word/2012/wordml" xmlns:w16cex="http://schemas.microsoft.com/office/word/2018/wordml/cex" xmlns:w16cid="http://schemas.microsoft.com/office/word/2016/wordml/cid" xmlns:w16="http://schemas.microsoft.com/office/word/2018/wordml" xmlns:w16du="http://schemas.microsoft.com/office/word/2023/wordml/word16du" xmlns:w16sdtdh="http://schemas.microsoft.com/office/word/2020/wordml/sdtdatahash" xmlns:w16sdtfl="http://schemas.microsoft.com/office/word/2024/wordml/sdtformatlock" xmlns:w16se="http://schemas.microsoft.com/office/word/2015/wordml/symex" xmlns:wpg="http://schemas.microsoft.com/office/word/2010/wordprocessingGroup" xmlns:wpi="http://schemas.microsoft.com/office/word/2010/wordprocessingInk" xmlns:wne="http://schemas.microsoft.com/office/word/2006/wordml" xmlns:wps="http://schemas.microsoft.com/office/word/2010/wordprocessingShape" mc:Ignorable="w14 w15 w16se w16cid w16 w16cex w16sdtdh w16sdtfl w16du wp14">
   <w:p>
     <w:pPr>
-      <w:pStyle w:val="Footer"/>
-      <w:rPr/>
+      <w:pStyle w:val="Rodap"/>
     </w:pPr>
     <w:r>
-      <w:rPr/>
+      <w:rPr>
+        <w:noProof/>
+      </w:rPr>
       <mc:AlternateContent>
         <mc:Choice Requires="wps">
           <w:drawing>
-            <wp:anchor distT="0" distB="12700" distL="0" distR="0" simplePos="0" relativeHeight="3" behindDoc="1" locked="0" layoutInCell="0" allowOverlap="1" wp14:anchorId="54AA7281">
+            <wp:anchor distT="0" distB="12700" distL="0" distR="0" simplePos="0" relativeHeight="251658240" behindDoc="1" locked="0" layoutInCell="0" allowOverlap="1" wp14:anchorId="54AA7281" wp14:editId="16854470">
               <wp:simplePos x="0" y="0"/>
               <wp:positionH relativeFrom="page">
                 <wp:posOffset>0</wp:posOffset>
@@ -897,6 +805,7 @@
               <wp:effectExtent l="0" t="0" r="0" b="12700"/>
               <wp:wrapNone/>
               <wp:docPr id="3" name="MSIPCMc4af449192361907e419e9b6" descr="{&quot;HashCode&quot;:501191150,&quot;Height&quot;:841.0,&quot;Width&quot;:595.0,&quot;Placement&quot;:&quot;Footer&quot;,&quot;Index&quot;:&quot;Primary&quot;,&quot;Section&quot;:1,&quot;Top&quot;:0.0,&quot;Left&quot;:0.0}"/>
+              <wp:cNvGraphicFramePr/>
               <a:graphic xmlns:a="http://schemas.openxmlformats.org/drawingml/2006/main">
                 <a:graphicData uri="http://schemas.microsoft.com/office/word/2010/wordprocessingShape">
                   <wps:wsp>
@@ -915,9 +824,15 @@
                       </a:ln>
                     </wps:spPr>
                     <wps:style>
-                      <a:lnRef idx="0"/>
-                      <a:fillRef idx="0"/>
-                      <a:effectRef idx="0"/>
+                      <a:lnRef idx="0">
+                        <a:scrgbClr r="0" g="0" b="0"/>
+                      </a:lnRef>
+                      <a:fillRef idx="0">
+                        <a:scrgbClr r="0" g="0" b="0"/>
+                      </a:fillRef>
+                      <a:effectRef idx="0">
+                        <a:scrgbClr r="0" g="0" b="0"/>
+                      </a:effectRef>
                       <a:fontRef idx="minor"/>
                     </wps:style>
                     <wps:txbx>
@@ -925,7 +840,7 @@
                         <w:p>
                           <w:pPr>
                             <w:pStyle w:val="Contedodoquadro"/>
-                            <w:jc w:val="end"/>
+                            <w:jc w:val="right"/>
                             <w:rPr>
                               <w:rFonts w:ascii="Calibri" w:hAnsi="Calibri" w:cs="Calibri"/>
                               <w:color w:val="000000"/>
@@ -934,17 +849,29 @@
                           </w:pPr>
                           <w:r>
                             <w:rPr>
-                              <w:rFonts w:cs="Calibri" w:ascii="Calibri" w:hAnsi="Calibri"/>
+                              <w:rFonts w:ascii="Calibri" w:hAnsi="Calibri" w:cs="Calibri"/>
                               <w:color w:val="000000"/>
                               <w:sz w:val="22"/>
                             </w:rPr>
-                            <w:t>Este conteúdo foi classificado como Interno</w:t>
+                            <w:t xml:space="preserve">Este conteúdo foi classificado </w:t>
                           </w:r>
+                          <w:proofErr w:type="gramStart"/>
+                          <w:r>
+                            <w:rPr>
+                              <w:rFonts w:ascii="Calibri" w:hAnsi="Calibri" w:cs="Calibri"/>
+                              <w:color w:val="000000"/>
+                              <w:sz w:val="22"/>
+                            </w:rPr>
+                            <w:t>como Interno</w:t>
+                          </w:r>
+                          <w:proofErr w:type="gramEnd"/>
                         </w:p>
                       </w:txbxContent>
                     </wps:txbx>
                     <wps:bodyPr tIns="0" rIns="254160" bIns="0" anchor="b">
-                      <a:prstTxWarp prst="textNoShape"/>
+                      <a:prstTxWarp prst="textNoShape">
+                        <a:avLst/>
+                      </a:prstTxWarp>
                       <a:noAutofit/>
                     </wps:bodyPr>
                   </wps:wsp>
@@ -955,15 +882,13 @@
         </mc:Choice>
         <mc:Fallback>
           <w:pict>
-            <v:rect id="shape_0" stroked="f" o:allowincell="f" style="position:absolute;margin-left:0pt;margin-top:805.35pt;width:595.25pt;height:21.45pt;mso-wrap-style:square;v-text-anchor:bottom;mso-position-horizontal-relative:page;mso-position-vertical-relative:page" wp14:anchorId="54AA7281">
-              <v:fill o:detectmouseclick="t" on="false"/>
-              <v:stroke color="#3465a4" weight="6480" joinstyle="round" endcap="flat"/>
-              <v:textbox>
+            <v:rect w14:anchorId="54AA7281" id="_x0000_s1027" alt="{&quot;HashCode&quot;:501191150,&quot;Height&quot;:841.0,&quot;Width&quot;:595.0,&quot;Placement&quot;:&quot;Footer&quot;,&quot;Index&quot;:&quot;Primary&quot;,&quot;Section&quot;:1,&quot;Top&quot;:0.0,&quot;Left&quot;:0.0}" style="position:absolute;margin-left:0;margin-top:805.35pt;width:595.3pt;height:21.5pt;z-index:-251658240;visibility:visible;mso-wrap-style:square;mso-wrap-distance-left:0;mso-wrap-distance-top:0;mso-wrap-distance-right:0;mso-wrap-distance-bottom:1pt;mso-position-horizontal:absolute;mso-position-horizontal-relative:page;mso-position-vertical:absolute;mso-position-vertical-relative:page;v-text-anchor:bottom" o:gfxdata="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" o:allowincell="f" filled="f" stroked="f" strokeweight=".5pt">
+              <v:textbox inset=",0,7.06mm,0">
                 <w:txbxContent>
                   <w:p>
                     <w:pPr>
                       <w:pStyle w:val="Contedodoquadro"/>
-                      <w:jc w:val="end"/>
+                      <w:jc w:val="right"/>
                       <w:rPr>
                         <w:rFonts w:ascii="Calibri" w:hAnsi="Calibri" w:cs="Calibri"/>
                         <w:color w:val="000000"/>
@@ -972,16 +897,26 @@
                     </w:pPr>
                     <w:r>
                       <w:rPr>
-                        <w:rFonts w:cs="Calibri" w:ascii="Calibri" w:hAnsi="Calibri"/>
+                        <w:rFonts w:ascii="Calibri" w:hAnsi="Calibri" w:cs="Calibri"/>
                         <w:color w:val="000000"/>
                         <w:sz w:val="22"/>
                       </w:rPr>
-                      <w:t>Este conteúdo foi classificado como Interno</w:t>
+                      <w:t xml:space="preserve">Este conteúdo foi classificado </w:t>
                     </w:r>
+                    <w:proofErr w:type="gramStart"/>
+                    <w:r>
+                      <w:rPr>
+                        <w:rFonts w:ascii="Calibri" w:hAnsi="Calibri" w:cs="Calibri"/>
+                        <w:color w:val="000000"/>
+                        <w:sz w:val="22"/>
+                      </w:rPr>
+                      <w:t>como Interno</w:t>
+                    </w:r>
+                    <w:proofErr w:type="gramEnd"/>
                   </w:p>
                 </w:txbxContent>
               </v:textbox>
-              <w10:wrap type="none"/>
+              <w10:wrap anchorx="page" anchory="page"/>
             </v:rect>
           </w:pict>
         </mc:Fallback>
@@ -991,19 +926,163 @@
 </w:ftr>
 </file>
 
+<file path=word/footnotes.xml><?xml version="1.0" encoding="utf-8"?>
+<w:footnotes xmlns:wpc="http://schemas.microsoft.com/office/word/2010/wordprocessingCanvas" xmlns:cx="http://schemas.microsoft.com/office/drawing/2014/chartex" xmlns:cx1="http://schemas.microsoft.com/office/drawing/2015/9/8/chartex" xmlns:cx2="http://schemas.microsoft.com/office/drawing/2015/10/21/chartex" xmlns:cx3="http://schemas.microsoft.com/office/drawing/2016/5/9/chartex" xmlns:cx4="http://schemas.microsoft.com/office/drawing/2016/5/10/chartex" xmlns:cx5="http://schemas.microsoft.com/office/drawing/2016/5/11/chartex" xmlns:cx6="http://schemas.microsoft.com/office/drawing/2016/5/12/chartex" xmlns:cx7="http://schemas.microsoft.com/office/drawing/2016/5/13/chartex" xmlns:cx8="http://schemas.microsoft.com/office/drawing/2016/5/14/chartex" xmlns:mc="http://schemas.openxmlformats.org/markup-compatibility/2006" xmlns:aink="http://schemas.microsoft.com/office/drawing/2016/ink" xmlns:am3d="http://schemas.microsoft.com/office/drawing/2017/model3d" xmlns:o="urn:schemas-microsoft-com:office:office" xmlns:oel="http://schemas.microsoft.com/office/2019/extlst" xmlns:r="http://schemas.openxmlformats.org/officeDocument/2006/relationships" xmlns:m="http://schemas.openxmlformats.org/officeDocument/2006/math" xmlns:v="urn:schemas-microsoft-com:vml" xmlns:wp14="http://schemas.microsoft.com/office/word/2010/wordprocessingDrawing" xmlns:wp="http://schemas.openxmlformats.org/drawingml/2006/wordprocessingDrawing" xmlns:w10="urn:schemas-microsoft-com:office:word" xmlns:w="http://schemas.openxmlformats.org/wordprocessingml/2006/main" xmlns:w14="http://schemas.microsoft.com/office/word/2010/wordml" xmlns:w15="http://schemas.microsoft.com/office/word/2012/wordml" xmlns:w16cex="http://schemas.microsoft.com/office/word/2018/wordml/cex" xmlns:w16cid="http://schemas.microsoft.com/office/word/2016/wordml/cid" xmlns:w16="http://schemas.microsoft.com/office/word/2018/wordml" xmlns:w16du="http://schemas.microsoft.com/office/word/2023/wordml/word16du" xmlns:w16sdtdh="http://schemas.microsoft.com/office/word/2020/wordml/sdtdatahash" xmlns:w16sdtfl="http://schemas.microsoft.com/office/word/2024/wordml/sdtformatlock" xmlns:w16se="http://schemas.microsoft.com/office/word/2015/wordml/symex" xmlns:wpg="http://schemas.microsoft.com/office/word/2010/wordprocessingGroup" xmlns:wpi="http://schemas.microsoft.com/office/word/2010/wordprocessingInk" xmlns:wne="http://schemas.microsoft.com/office/word/2006/wordml" xmlns:wps="http://schemas.microsoft.com/office/word/2010/wordprocessingShape" mc:Ignorable="w14 w15 w16se w16cid w16 w16cex w16sdtdh w16sdtfl w16du wp14">
+  <w:footnote w:type="separator" w:id="-1">
+    <w:p>
+      <w:r>
+        <w:separator/>
+      </w:r>
+    </w:p>
+  </w:footnote>
+  <w:footnote w:type="continuationSeparator" w:id="0">
+    <w:p>
+      <w:r>
+        <w:continuationSeparator/>
+      </w:r>
+    </w:p>
+  </w:footnote>
+</w:footnotes>
+</file>
+
 <file path=word/numbering.xml><?xml version="1.0" encoding="utf-8"?>
-<w:numbering xmlns:w="http://schemas.openxmlformats.org/wordprocessingml/2006/main" xmlns:o="urn:schemas-microsoft-com:office:office" xmlns:r="http://schemas.openxmlformats.org/officeDocument/2006/relationships" xmlns:v="urn:schemas-microsoft-com:vml" xmlns:mc="http://schemas.openxmlformats.org/markup-compatibility/2006" xmlns:w14="http://schemas.microsoft.com/office/word/2010/wordml" mc:Ignorable="w14">
-  <w:abstractNum w:abstractNumId="1">
+<w:numbering xmlns:wpc="http://schemas.microsoft.com/office/word/2010/wordprocessingCanvas" xmlns:cx="http://schemas.microsoft.com/office/drawing/2014/chartex" xmlns:cx1="http://schemas.microsoft.com/office/drawing/2015/9/8/chartex" xmlns:cx2="http://schemas.microsoft.com/office/drawing/2015/10/21/chartex" xmlns:cx3="http://schemas.microsoft.com/office/drawing/2016/5/9/chartex" xmlns:cx4="http://schemas.microsoft.com/office/drawing/2016/5/10/chartex" xmlns:cx5="http://schemas.microsoft.com/office/drawing/2016/5/11/chartex" xmlns:cx6="http://schemas.microsoft.com/office/drawing/2016/5/12/chartex" xmlns:cx7="http://schemas.microsoft.com/office/drawing/2016/5/13/chartex" xmlns:cx8="http://schemas.microsoft.com/office/drawing/2016/5/14/chartex" xmlns:mc="http://schemas.openxmlformats.org/markup-compatibility/2006" xmlns:aink="http://schemas.microsoft.com/office/drawing/2016/ink" xmlns:am3d="http://schemas.microsoft.com/office/drawing/2017/model3d" xmlns:o="urn:schemas-microsoft-com:office:office" xmlns:oel="http://schemas.microsoft.com/office/2019/extlst" xmlns:r="http://schemas.openxmlformats.org/officeDocument/2006/relationships" xmlns:m="http://schemas.openxmlformats.org/officeDocument/2006/math" xmlns:v="urn:schemas-microsoft-com:vml" xmlns:wp14="http://schemas.microsoft.com/office/word/2010/wordprocessingDrawing" xmlns:wp="http://schemas.openxmlformats.org/drawingml/2006/wordprocessingDrawing" xmlns:w10="urn:schemas-microsoft-com:office:word" xmlns:w="http://schemas.openxmlformats.org/wordprocessingml/2006/main" xmlns:w14="http://schemas.microsoft.com/office/word/2010/wordml" xmlns:w15="http://schemas.microsoft.com/office/word/2012/wordml" xmlns:w16cex="http://schemas.microsoft.com/office/word/2018/wordml/cex" xmlns:w16cid="http://schemas.microsoft.com/office/word/2016/wordml/cid" xmlns:w16="http://schemas.microsoft.com/office/word/2018/wordml" xmlns:w16du="http://schemas.microsoft.com/office/word/2023/wordml/word16du" xmlns:w16sdtdh="http://schemas.microsoft.com/office/word/2020/wordml/sdtdatahash" xmlns:w16sdtfl="http://schemas.microsoft.com/office/word/2024/wordml/sdtformatlock" xmlns:w16se="http://schemas.microsoft.com/office/word/2015/wordml/symex" xmlns:wpg="http://schemas.microsoft.com/office/word/2010/wordprocessingGroup" xmlns:wpi="http://schemas.microsoft.com/office/word/2010/wordprocessingInk" xmlns:wne="http://schemas.microsoft.com/office/word/2006/wordml" xmlns:wps="http://schemas.microsoft.com/office/word/2010/wordprocessingShape" mc:Ignorable="w14 w15 w16se w16cid w16 w16cex w16sdtdh w16sdtfl w16du wp14">
+  <w:abstractNum w:abstractNumId="0" w15:restartNumberingAfterBreak="0">
+    <w:nsid w:val="0B626ABF"/>
+    <w:multiLevelType w:val="multilevel"/>
+    <w:tmpl w:val="EC32BDD8"/>
     <w:lvl w:ilvl="0">
       <w:start w:val="1"/>
-      <w:numFmt w:val="bullet"/>
-      <w:lvlText w:val=""/>
-      <w:lvlJc w:val="start"/>
+      <w:numFmt w:val="none"/>
+      <w:suff w:val="nothing"/>
+      <w:lvlText w:val=""/>
+      <w:lvlJc w:val="left"/>
       <w:pPr>
         <w:tabs>
           <w:tab w:val="num" w:pos="0"/>
         </w:tabs>
-        <w:ind w:start="1080" w:hanging="360"/>
+        <w:ind w:left="0" w:firstLine="0"/>
+      </w:pPr>
+    </w:lvl>
+    <w:lvl w:ilvl="1">
+      <w:start w:val="1"/>
+      <w:numFmt w:val="none"/>
+      <w:suff w:val="nothing"/>
+      <w:lvlText w:val=""/>
+      <w:lvlJc w:val="left"/>
+      <w:pPr>
+        <w:tabs>
+          <w:tab w:val="num" w:pos="0"/>
+        </w:tabs>
+        <w:ind w:left="0" w:firstLine="0"/>
+      </w:pPr>
+    </w:lvl>
+    <w:lvl w:ilvl="2">
+      <w:start w:val="1"/>
+      <w:numFmt w:val="none"/>
+      <w:suff w:val="nothing"/>
+      <w:lvlText w:val=""/>
+      <w:lvlJc w:val="left"/>
+      <w:pPr>
+        <w:tabs>
+          <w:tab w:val="num" w:pos="0"/>
+        </w:tabs>
+        <w:ind w:left="0" w:firstLine="0"/>
+      </w:pPr>
+    </w:lvl>
+    <w:lvl w:ilvl="3">
+      <w:start w:val="1"/>
+      <w:numFmt w:val="none"/>
+      <w:suff w:val="nothing"/>
+      <w:lvlText w:val=""/>
+      <w:lvlJc w:val="left"/>
+      <w:pPr>
+        <w:tabs>
+          <w:tab w:val="num" w:pos="0"/>
+        </w:tabs>
+        <w:ind w:left="0" w:firstLine="0"/>
+      </w:pPr>
+    </w:lvl>
+    <w:lvl w:ilvl="4">
+      <w:start w:val="1"/>
+      <w:numFmt w:val="none"/>
+      <w:suff w:val="nothing"/>
+      <w:lvlText w:val=""/>
+      <w:lvlJc w:val="left"/>
+      <w:pPr>
+        <w:tabs>
+          <w:tab w:val="num" w:pos="0"/>
+        </w:tabs>
+        <w:ind w:left="0" w:firstLine="0"/>
+      </w:pPr>
+    </w:lvl>
+    <w:lvl w:ilvl="5">
+      <w:start w:val="1"/>
+      <w:numFmt w:val="none"/>
+      <w:suff w:val="nothing"/>
+      <w:lvlText w:val=""/>
+      <w:lvlJc w:val="left"/>
+      <w:pPr>
+        <w:tabs>
+          <w:tab w:val="num" w:pos="0"/>
+        </w:tabs>
+        <w:ind w:left="0" w:firstLine="0"/>
+      </w:pPr>
+    </w:lvl>
+    <w:lvl w:ilvl="6">
+      <w:start w:val="1"/>
+      <w:numFmt w:val="none"/>
+      <w:suff w:val="nothing"/>
+      <w:lvlText w:val=""/>
+      <w:lvlJc w:val="left"/>
+      <w:pPr>
+        <w:tabs>
+          <w:tab w:val="num" w:pos="0"/>
+        </w:tabs>
+        <w:ind w:left="0" w:firstLine="0"/>
+      </w:pPr>
+    </w:lvl>
+    <w:lvl w:ilvl="7">
+      <w:start w:val="1"/>
+      <w:numFmt w:val="none"/>
+      <w:suff w:val="nothing"/>
+      <w:lvlText w:val=""/>
+      <w:lvlJc w:val="left"/>
+      <w:pPr>
+        <w:tabs>
+          <w:tab w:val="num" w:pos="0"/>
+        </w:tabs>
+        <w:ind w:left="0" w:firstLine="0"/>
+      </w:pPr>
+    </w:lvl>
+    <w:lvl w:ilvl="8">
+      <w:start w:val="1"/>
+      <w:numFmt w:val="none"/>
+      <w:suff w:val="nothing"/>
+      <w:lvlText w:val=""/>
+      <w:lvlJc w:val="left"/>
+      <w:pPr>
+        <w:tabs>
+          <w:tab w:val="num" w:pos="0"/>
+        </w:tabs>
+        <w:ind w:left="0" w:firstLine="0"/>
+      </w:pPr>
+    </w:lvl>
+  </w:abstractNum>
+  <w:abstractNum w:abstractNumId="1" w15:restartNumberingAfterBreak="0">
+    <w:nsid w:val="3C9D07BB"/>
+    <w:multiLevelType w:val="multilevel"/>
+    <w:tmpl w:val="E13088A4"/>
+    <w:lvl w:ilvl="0">
+      <w:start w:val="1"/>
+      <w:numFmt w:val="bullet"/>
+      <w:lvlText w:val=""/>
+      <w:lvlJc w:val="left"/>
+      <w:pPr>
+        <w:tabs>
+          <w:tab w:val="num" w:pos="0"/>
+        </w:tabs>
+        <w:ind w:left="1080" w:hanging="360"/>
       </w:pPr>
       <w:rPr>
         <w:rFonts w:ascii="Symbol" w:hAnsi="Symbol" w:cs="Symbol" w:hint="default"/>
@@ -1013,12 +1092,12 @@
       <w:start w:val="1"/>
       <w:numFmt w:val="bullet"/>
       <w:lvlText w:val="o"/>
-      <w:lvlJc w:val="start"/>
+      <w:lvlJc w:val="left"/>
       <w:pPr>
         <w:tabs>
           <w:tab w:val="num" w:pos="0"/>
         </w:tabs>
-        <w:ind w:start="1800" w:hanging="360"/>
+        <w:ind w:left="1800" w:hanging="360"/>
       </w:pPr>
       <w:rPr>
         <w:rFonts w:ascii="Courier New" w:hAnsi="Courier New" w:cs="Courier New" w:hint="default"/>
@@ -1028,12 +1107,12 @@
       <w:start w:val="1"/>
       <w:numFmt w:val="bullet"/>
       <w:lvlText w:val=""/>
-      <w:lvlJc w:val="start"/>
+      <w:lvlJc w:val="left"/>
       <w:pPr>
         <w:tabs>
           <w:tab w:val="num" w:pos="0"/>
         </w:tabs>
-        <w:ind w:start="2520" w:hanging="360"/>
+        <w:ind w:left="2520" w:hanging="360"/>
       </w:pPr>
       <w:rPr>
         <w:rFonts w:ascii="Wingdings" w:hAnsi="Wingdings" w:cs="Wingdings" w:hint="default"/>
@@ -1043,12 +1122,12 @@
       <w:start w:val="1"/>
       <w:numFmt w:val="bullet"/>
       <w:lvlText w:val=""/>
-      <w:lvlJc w:val="start"/>
+      <w:lvlJc w:val="left"/>
       <w:pPr>
         <w:tabs>
           <w:tab w:val="num" w:pos="0"/>
         </w:tabs>
-        <w:ind w:start="3240" w:hanging="360"/>
+        <w:ind w:left="3240" w:hanging="360"/>
       </w:pPr>
       <w:rPr>
         <w:rFonts w:ascii="Symbol" w:hAnsi="Symbol" w:cs="Symbol" w:hint="default"/>
@@ -1058,12 +1137,12 @@
       <w:start w:val="1"/>
       <w:numFmt w:val="bullet"/>
       <w:lvlText w:val="o"/>
-      <w:lvlJc w:val="start"/>
+      <w:lvlJc w:val="left"/>
       <w:pPr>
         <w:tabs>
           <w:tab w:val="num" w:pos="0"/>
         </w:tabs>
-        <w:ind w:start="3960" w:hanging="360"/>
+        <w:ind w:left="3960" w:hanging="360"/>
       </w:pPr>
       <w:rPr>
         <w:rFonts w:ascii="Courier New" w:hAnsi="Courier New" w:cs="Courier New" w:hint="default"/>
@@ -1073,12 +1152,12 @@
       <w:start w:val="1"/>
       <w:numFmt w:val="bullet"/>
       <w:lvlText w:val=""/>
-      <w:lvlJc w:val="start"/>
+      <w:lvlJc w:val="left"/>
       <w:pPr>
         <w:tabs>
           <w:tab w:val="num" w:pos="0"/>
         </w:tabs>
-        <w:ind w:start="4680" w:hanging="360"/>
+        <w:ind w:left="4680" w:hanging="360"/>
       </w:pPr>
       <w:rPr>
         <w:rFonts w:ascii="Wingdings" w:hAnsi="Wingdings" w:cs="Wingdings" w:hint="default"/>
@@ -1088,12 +1167,12 @@
       <w:start w:val="1"/>
       <w:numFmt w:val="bullet"/>
       <w:lvlText w:val=""/>
-      <w:lvlJc w:val="start"/>
+      <w:lvlJc w:val="left"/>
       <w:pPr>
         <w:tabs>
           <w:tab w:val="num" w:pos="0"/>
         </w:tabs>
-        <w:ind w:start="5400" w:hanging="360"/>
+        <w:ind w:left="5400" w:hanging="360"/>
       </w:pPr>
       <w:rPr>
         <w:rFonts w:ascii="Symbol" w:hAnsi="Symbol" w:cs="Symbol" w:hint="default"/>
@@ -1103,12 +1182,12 @@
       <w:start w:val="1"/>
       <w:numFmt w:val="bullet"/>
       <w:lvlText w:val="o"/>
-      <w:lvlJc w:val="start"/>
+      <w:lvlJc w:val="left"/>
       <w:pPr>
         <w:tabs>
           <w:tab w:val="num" w:pos="0"/>
         </w:tabs>
-        <w:ind w:start="6120" w:hanging="360"/>
+        <w:ind w:left="6120" w:hanging="360"/>
       </w:pPr>
       <w:rPr>
         <w:rFonts w:ascii="Courier New" w:hAnsi="Courier New" w:cs="Courier New" w:hint="default"/>
@@ -1118,152 +1197,149 @@
       <w:start w:val="1"/>
       <w:numFmt w:val="bullet"/>
       <w:lvlText w:val=""/>
-      <w:lvlJc w:val="start"/>
+      <w:lvlJc w:val="left"/>
       <w:pPr>
         <w:tabs>
           <w:tab w:val="num" w:pos="0"/>
         </w:tabs>
-        <w:ind w:start="6840" w:hanging="360"/>
+        <w:ind w:left="6840" w:hanging="360"/>
       </w:pPr>
       <w:rPr>
         <w:rFonts w:ascii="Wingdings" w:hAnsi="Wingdings" w:cs="Wingdings" w:hint="default"/>
       </w:rPr>
     </w:lvl>
   </w:abstractNum>
-  <w:abstractNum w:abstractNumId="2">
-    <w:lvl w:ilvl="0">
-      <w:start w:val="1"/>
-      <w:numFmt w:val="none"/>
-      <w:suff w:val="nothing"/>
-      <w:lvlText w:val=""/>
-      <w:lvlJc w:val="start"/>
-      <w:pPr>
-        <w:tabs>
-          <w:tab w:val="num" w:pos="0"/>
-        </w:tabs>
-        <w:ind w:start="0" w:hanging="0"/>
-      </w:pPr>
-    </w:lvl>
-    <w:lvl w:ilvl="1">
-      <w:start w:val="1"/>
-      <w:numFmt w:val="none"/>
-      <w:suff w:val="nothing"/>
-      <w:lvlText w:val=""/>
-      <w:lvlJc w:val="start"/>
-      <w:pPr>
-        <w:tabs>
-          <w:tab w:val="num" w:pos="0"/>
-        </w:tabs>
-        <w:ind w:start="0" w:hanging="0"/>
-      </w:pPr>
-    </w:lvl>
-    <w:lvl w:ilvl="2">
-      <w:start w:val="1"/>
-      <w:numFmt w:val="none"/>
-      <w:suff w:val="nothing"/>
-      <w:lvlText w:val=""/>
-      <w:lvlJc w:val="start"/>
-      <w:pPr>
-        <w:tabs>
-          <w:tab w:val="num" w:pos="0"/>
-        </w:tabs>
-        <w:ind w:start="0" w:hanging="0"/>
-      </w:pPr>
-    </w:lvl>
-    <w:lvl w:ilvl="3">
-      <w:start w:val="1"/>
-      <w:numFmt w:val="none"/>
-      <w:suff w:val="nothing"/>
-      <w:lvlText w:val=""/>
-      <w:lvlJc w:val="start"/>
-      <w:pPr>
-        <w:tabs>
-          <w:tab w:val="num" w:pos="0"/>
-        </w:tabs>
-        <w:ind w:start="0" w:hanging="0"/>
-      </w:pPr>
-    </w:lvl>
-    <w:lvl w:ilvl="4">
-      <w:start w:val="1"/>
-      <w:numFmt w:val="none"/>
-      <w:suff w:val="nothing"/>
-      <w:lvlText w:val=""/>
-      <w:lvlJc w:val="start"/>
-      <w:pPr>
-        <w:tabs>
-          <w:tab w:val="num" w:pos="0"/>
-        </w:tabs>
-        <w:ind w:start="0" w:hanging="0"/>
-      </w:pPr>
-    </w:lvl>
-    <w:lvl w:ilvl="5">
-      <w:start w:val="1"/>
-      <w:numFmt w:val="none"/>
-      <w:suff w:val="nothing"/>
-      <w:lvlText w:val=""/>
-      <w:lvlJc w:val="start"/>
-      <w:pPr>
-        <w:tabs>
-          <w:tab w:val="num" w:pos="0"/>
-        </w:tabs>
-        <w:ind w:start="0" w:hanging="0"/>
-      </w:pPr>
-    </w:lvl>
-    <w:lvl w:ilvl="6">
-      <w:start w:val="1"/>
-      <w:numFmt w:val="none"/>
-      <w:suff w:val="nothing"/>
-      <w:lvlText w:val=""/>
-      <w:lvlJc w:val="start"/>
-      <w:pPr>
-        <w:tabs>
-          <w:tab w:val="num" w:pos="0"/>
-        </w:tabs>
-        <w:ind w:start="0" w:hanging="0"/>
-      </w:pPr>
-    </w:lvl>
-    <w:lvl w:ilvl="7">
-      <w:start w:val="1"/>
-      <w:numFmt w:val="none"/>
-      <w:suff w:val="nothing"/>
-      <w:lvlText w:val=""/>
-      <w:lvlJc w:val="start"/>
-      <w:pPr>
-        <w:tabs>
-          <w:tab w:val="num" w:pos="0"/>
-        </w:tabs>
-        <w:ind w:start="0" w:hanging="0"/>
-      </w:pPr>
-    </w:lvl>
-    <w:lvl w:ilvl="8">
-      <w:start w:val="1"/>
-      <w:numFmt w:val="none"/>
-      <w:suff w:val="nothing"/>
-      <w:lvlText w:val=""/>
-      <w:lvlJc w:val="start"/>
-      <w:pPr>
-        <w:tabs>
-          <w:tab w:val="num" w:pos="0"/>
-        </w:tabs>
-        <w:ind w:start="0" w:hanging="0"/>
-      </w:pPr>
+  <w:abstractNum w:abstractNumId="2" w15:restartNumberingAfterBreak="0">
+    <w:nsid w:val="79033D35"/>
+    <w:multiLevelType w:val="hybridMultilevel"/>
+    <w:tmpl w:val="C706B31C"/>
+    <w:lvl w:ilvl="0" w:tplc="04160001">
+      <w:start w:val="1"/>
+      <w:numFmt w:val="bullet"/>
+      <w:lvlText w:val=""/>
+      <w:lvlJc w:val="left"/>
+      <w:pPr>
+        <w:ind w:left="720" w:hanging="360"/>
+      </w:pPr>
+      <w:rPr>
+        <w:rFonts w:ascii="Symbol" w:hAnsi="Symbol" w:hint="default"/>
+      </w:rPr>
+    </w:lvl>
+    <w:lvl w:ilvl="1" w:tplc="04160003" w:tentative="1">
+      <w:start w:val="1"/>
+      <w:numFmt w:val="bullet"/>
+      <w:lvlText w:val="o"/>
+      <w:lvlJc w:val="left"/>
+      <w:pPr>
+        <w:ind w:left="1440" w:hanging="360"/>
+      </w:pPr>
+      <w:rPr>
+        <w:rFonts w:ascii="Courier New" w:hAnsi="Courier New" w:cs="Courier New" w:hint="default"/>
+      </w:rPr>
+    </w:lvl>
+    <w:lvl w:ilvl="2" w:tplc="04160005" w:tentative="1">
+      <w:start w:val="1"/>
+      <w:numFmt w:val="bullet"/>
+      <w:lvlText w:val=""/>
+      <w:lvlJc w:val="left"/>
+      <w:pPr>
+        <w:ind w:left="2160" w:hanging="360"/>
+      </w:pPr>
+      <w:rPr>
+        <w:rFonts w:ascii="Wingdings" w:hAnsi="Wingdings" w:hint="default"/>
+      </w:rPr>
+    </w:lvl>
+    <w:lvl w:ilvl="3" w:tplc="04160001" w:tentative="1">
+      <w:start w:val="1"/>
+      <w:numFmt w:val="bullet"/>
+      <w:lvlText w:val=""/>
+      <w:lvlJc w:val="left"/>
+      <w:pPr>
+        <w:ind w:left="2880" w:hanging="360"/>
+      </w:pPr>
+      <w:rPr>
+        <w:rFonts w:ascii="Symbol" w:hAnsi="Symbol" w:hint="default"/>
+      </w:rPr>
+    </w:lvl>
+    <w:lvl w:ilvl="4" w:tplc="04160003" w:tentative="1">
+      <w:start w:val="1"/>
+      <w:numFmt w:val="bullet"/>
+      <w:lvlText w:val="o"/>
+      <w:lvlJc w:val="left"/>
+      <w:pPr>
+        <w:ind w:left="3600" w:hanging="360"/>
+      </w:pPr>
+      <w:rPr>
+        <w:rFonts w:ascii="Courier New" w:hAnsi="Courier New" w:cs="Courier New" w:hint="default"/>
+      </w:rPr>
+    </w:lvl>
+    <w:lvl w:ilvl="5" w:tplc="04160005" w:tentative="1">
+      <w:start w:val="1"/>
+      <w:numFmt w:val="bullet"/>
+      <w:lvlText w:val=""/>
+      <w:lvlJc w:val="left"/>
+      <w:pPr>
+        <w:ind w:left="4320" w:hanging="360"/>
+      </w:pPr>
+      <w:rPr>
+        <w:rFonts w:ascii="Wingdings" w:hAnsi="Wingdings" w:hint="default"/>
+      </w:rPr>
+    </w:lvl>
+    <w:lvl w:ilvl="6" w:tplc="04160001" w:tentative="1">
+      <w:start w:val="1"/>
+      <w:numFmt w:val="bullet"/>
+      <w:lvlText w:val=""/>
+      <w:lvlJc w:val="left"/>
+      <w:pPr>
+        <w:ind w:left="5040" w:hanging="360"/>
+      </w:pPr>
+      <w:rPr>
+        <w:rFonts w:ascii="Symbol" w:hAnsi="Symbol" w:hint="default"/>
+      </w:rPr>
+    </w:lvl>
+    <w:lvl w:ilvl="7" w:tplc="04160003" w:tentative="1">
+      <w:start w:val="1"/>
+      <w:numFmt w:val="bullet"/>
+      <w:lvlText w:val="o"/>
+      <w:lvlJc w:val="left"/>
+      <w:pPr>
+        <w:ind w:left="5760" w:hanging="360"/>
+      </w:pPr>
+      <w:rPr>
+        <w:rFonts w:ascii="Courier New" w:hAnsi="Courier New" w:cs="Courier New" w:hint="default"/>
+      </w:rPr>
+    </w:lvl>
+    <w:lvl w:ilvl="8" w:tplc="04160005" w:tentative="1">
+      <w:start w:val="1"/>
+      <w:numFmt w:val="bullet"/>
+      <w:lvlText w:val=""/>
+      <w:lvlJc w:val="left"/>
+      <w:pPr>
+        <w:ind w:left="6480" w:hanging="360"/>
+      </w:pPr>
+      <w:rPr>
+        <w:rFonts w:ascii="Wingdings" w:hAnsi="Wingdings" w:hint="default"/>
+      </w:rPr>
     </w:lvl>
   </w:abstractNum>
-  <w:num w:numId="1">
+  <w:num w:numId="1" w16cid:durableId="630020359">
     <w:abstractNumId w:val="1"/>
   </w:num>
-  <w:num w:numId="2">
+  <w:num w:numId="2" w16cid:durableId="653413961">
+    <w:abstractNumId w:val="0"/>
+  </w:num>
+  <w:num w:numId="3" w16cid:durableId="117920189">
     <w:abstractNumId w:val="2"/>
   </w:num>
 </w:numbering>
 </file>
 
 <file path=word/styles.xml><?xml version="1.0" encoding="utf-8"?>
-<w:styles xmlns:w="http://schemas.openxmlformats.org/wordprocessingml/2006/main" xmlns:w14="http://schemas.microsoft.com/office/word/2010/wordml" xmlns:mc="http://schemas.openxmlformats.org/markup-compatibility/2006" mc:Ignorable="w14">
+<w:styles xmlns:mc="http://schemas.openxmlformats.org/markup-compatibility/2006" xmlns:r="http://schemas.openxmlformats.org/officeDocument/2006/relationships" xmlns:w="http://schemas.openxmlformats.org/wordprocessingml/2006/main" xmlns:w14="http://schemas.microsoft.com/office/word/2010/wordml" xmlns:w15="http://schemas.microsoft.com/office/word/2012/wordml" xmlns:w16cex="http://schemas.microsoft.com/office/word/2018/wordml/cex" xmlns:w16cid="http://schemas.microsoft.com/office/word/2016/wordml/cid" xmlns:w16="http://schemas.microsoft.com/office/word/2018/wordml" xmlns:w16du="http://schemas.microsoft.com/office/word/2023/wordml/word16du" xmlns:w16sdtdh="http://schemas.microsoft.com/office/word/2020/wordml/sdtdatahash" xmlns:w16sdtfl="http://schemas.microsoft.com/office/word/2024/wordml/sdtformatlock" xmlns:w16se="http://schemas.microsoft.com/office/word/2015/wordml/symex" mc:Ignorable="w14 w15 w16se w16cid w16 w16cex w16sdtdh w16sdtfl w16du">
   <w:docDefaults>
     <w:rPrDefault>
       <w:rPr>
-        <w:rFonts w:ascii="Liberation Serif" w:hAnsi="Liberation Serif" w:eastAsia="NSimSun" w:cs="Lucida Sans"/>
+        <w:rFonts w:ascii="Liberation Serif" w:eastAsia="NSimSun" w:hAnsi="Liberation Serif" w:cs="Lucida Sans"/>
         <w:kern w:val="2"/>
         <w:sz w:val="24"/>
         <w:szCs w:val="24"/>
@@ -1272,21 +1348,21 @@
     </w:rPrDefault>
     <w:pPrDefault>
       <w:pPr>
-        <w:suppressAutoHyphens w:val="true"/>
+        <w:suppressAutoHyphens/>
       </w:pPr>
     </w:pPrDefault>
   </w:docDefaults>
   <w:latentStyles w:defLockedState="0" w:defUIPriority="99" w:defSemiHidden="0" w:defUnhideWhenUsed="0" w:defQFormat="0" w:count="376">
     <w:lsdException w:name="Normal" w:uiPriority="0" w:qFormat="1"/>
     <w:lsdException w:name="heading 1" w:uiPriority="9" w:qFormat="1"/>
-    <w:lsdException w:name="heading 2" w:uiPriority="9" w:semiHidden="1" w:unhideWhenUsed="1" w:qFormat="1"/>
-    <w:lsdException w:name="heading 3" w:uiPriority="9" w:semiHidden="1" w:unhideWhenUsed="1" w:qFormat="1"/>
-    <w:lsdException w:name="heading 4" w:uiPriority="9" w:semiHidden="1" w:unhideWhenUsed="1" w:qFormat="1"/>
-    <w:lsdException w:name="heading 5" w:uiPriority="9" w:semiHidden="1" w:unhideWhenUsed="1" w:qFormat="1"/>
-    <w:lsdException w:name="heading 6" w:uiPriority="9" w:semiHidden="1" w:unhideWhenUsed="1" w:qFormat="1"/>
-    <w:lsdException w:name="heading 7" w:uiPriority="9" w:semiHidden="1" w:unhideWhenUsed="1" w:qFormat="1"/>
-    <w:lsdException w:name="heading 8" w:uiPriority="9" w:semiHidden="1" w:unhideWhenUsed="1" w:qFormat="1"/>
-    <w:lsdException w:name="heading 9" w:uiPriority="9" w:semiHidden="1" w:unhideWhenUsed="1" w:qFormat="1"/>
+    <w:lsdException w:name="heading 2" w:semiHidden="1" w:uiPriority="9" w:unhideWhenUsed="1" w:qFormat="1"/>
+    <w:lsdException w:name="heading 3" w:semiHidden="1" w:uiPriority="9" w:unhideWhenUsed="1" w:qFormat="1"/>
+    <w:lsdException w:name="heading 4" w:semiHidden="1" w:uiPriority="9" w:unhideWhenUsed="1" w:qFormat="1"/>
+    <w:lsdException w:name="heading 5" w:semiHidden="1" w:uiPriority="9" w:unhideWhenUsed="1" w:qFormat="1"/>
+    <w:lsdException w:name="heading 6" w:semiHidden="1" w:uiPriority="9" w:unhideWhenUsed="1" w:qFormat="1"/>
+    <w:lsdException w:name="heading 7" w:semiHidden="1" w:uiPriority="9" w:unhideWhenUsed="1" w:qFormat="1"/>
+    <w:lsdException w:name="heading 8" w:semiHidden="1" w:uiPriority="9" w:unhideWhenUsed="1" w:qFormat="1"/>
+    <w:lsdException w:name="heading 9" w:semiHidden="1" w:uiPriority="9" w:unhideWhenUsed="1" w:qFormat="1"/>
     <w:lsdException w:name="index 1" w:semiHidden="1" w:unhideWhenUsed="1"/>
     <w:lsdException w:name="index 2" w:semiHidden="1" w:unhideWhenUsed="1"/>
     <w:lsdException w:name="index 3" w:semiHidden="1" w:unhideWhenUsed="1"/>
@@ -1296,22 +1372,22 @@
     <w:lsdException w:name="index 7" w:semiHidden="1" w:unhideWhenUsed="1"/>
     <w:lsdException w:name="index 8" w:semiHidden="1" w:unhideWhenUsed="1"/>
     <w:lsdException w:name="index 9" w:semiHidden="1" w:unhideWhenUsed="1"/>
-    <w:lsdException w:name="toc 1" w:uiPriority="39" w:semiHidden="1" w:unhideWhenUsed="1"/>
-    <w:lsdException w:name="toc 2" w:uiPriority="39" w:semiHidden="1" w:unhideWhenUsed="1"/>
-    <w:lsdException w:name="toc 3" w:uiPriority="39" w:semiHidden="1" w:unhideWhenUsed="1"/>
-    <w:lsdException w:name="toc 4" w:uiPriority="39" w:semiHidden="1" w:unhideWhenUsed="1"/>
-    <w:lsdException w:name="toc 5" w:uiPriority="39" w:semiHidden="1" w:unhideWhenUsed="1"/>
-    <w:lsdException w:name="toc 6" w:uiPriority="39" w:semiHidden="1" w:unhideWhenUsed="1"/>
-    <w:lsdException w:name="toc 7" w:uiPriority="39" w:semiHidden="1" w:unhideWhenUsed="1"/>
-    <w:lsdException w:name="toc 8" w:uiPriority="39" w:semiHidden="1" w:unhideWhenUsed="1"/>
-    <w:lsdException w:name="toc 9" w:uiPriority="39" w:semiHidden="1" w:unhideWhenUsed="1"/>
+    <w:lsdException w:name="toc 1" w:semiHidden="1" w:uiPriority="39" w:unhideWhenUsed="1"/>
+    <w:lsdException w:name="toc 2" w:semiHidden="1" w:uiPriority="39" w:unhideWhenUsed="1"/>
+    <w:lsdException w:name="toc 3" w:semiHidden="1" w:uiPriority="39" w:unhideWhenUsed="1"/>
+    <w:lsdException w:name="toc 4" w:semiHidden="1" w:uiPriority="39" w:unhideWhenUsed="1"/>
+    <w:lsdException w:name="toc 5" w:semiHidden="1" w:uiPriority="39" w:unhideWhenUsed="1"/>
+    <w:lsdException w:name="toc 6" w:semiHidden="1" w:uiPriority="39" w:unhideWhenUsed="1"/>
+    <w:lsdException w:name="toc 7" w:semiHidden="1" w:uiPriority="39" w:unhideWhenUsed="1"/>
+    <w:lsdException w:name="toc 8" w:semiHidden="1" w:uiPriority="39" w:unhideWhenUsed="1"/>
+    <w:lsdException w:name="toc 9" w:semiHidden="1" w:uiPriority="39" w:unhideWhenUsed="1"/>
     <w:lsdException w:name="Normal Indent" w:semiHidden="1" w:unhideWhenUsed="1"/>
     <w:lsdException w:name="footnote text" w:semiHidden="1" w:unhideWhenUsed="1"/>
     <w:lsdException w:name="annotation text" w:semiHidden="1" w:unhideWhenUsed="1"/>
     <w:lsdException w:name="header" w:semiHidden="1" w:unhideWhenUsed="1"/>
     <w:lsdException w:name="footer" w:semiHidden="1" w:unhideWhenUsed="1"/>
     <w:lsdException w:name="index heading" w:semiHidden="1" w:unhideWhenUsed="1"/>
-    <w:lsdException w:name="caption" w:uiPriority="35" w:semiHidden="1" w:unhideWhenUsed="1" w:qFormat="1"/>
+    <w:lsdException w:name="caption" w:semiHidden="1" w:uiPriority="35" w:unhideWhenUsed="1" w:qFormat="1"/>
     <w:lsdException w:name="table of figures" w:semiHidden="1" w:unhideWhenUsed="1"/>
     <w:lsdException w:name="envelope address" w:semiHidden="1" w:unhideWhenUsed="1"/>
     <w:lsdException w:name="envelope return" w:semiHidden="1" w:unhideWhenUsed="1"/>
@@ -1342,7 +1418,7 @@
     <w:lsdException w:name="Title" w:uiPriority="10" w:qFormat="1"/>
     <w:lsdException w:name="Closing" w:semiHidden="1" w:unhideWhenUsed="1"/>
     <w:lsdException w:name="Signature" w:semiHidden="1" w:unhideWhenUsed="1"/>
-    <w:lsdException w:name="Default Paragraph Font" w:uiPriority="1" w:semiHidden="1" w:unhideWhenUsed="1"/>
+    <w:lsdException w:name="Default Paragraph Font" w:semiHidden="1" w:uiPriority="1" w:unhideWhenUsed="1"/>
     <w:lsdException w:name="Body Text" w:semiHidden="1" w:unhideWhenUsed="1"/>
     <w:lsdException w:name="Body Text Indent" w:semiHidden="1" w:unhideWhenUsed="1"/>
     <w:lsdException w:name="List Continue" w:semiHidden="1" w:unhideWhenUsed="1"/>
@@ -1542,8 +1618,8 @@
     <w:lsdException w:name="Subtle Reference" w:uiPriority="31" w:qFormat="1"/>
     <w:lsdException w:name="Intense Reference" w:uiPriority="32" w:qFormat="1"/>
     <w:lsdException w:name="Book Title" w:uiPriority="33" w:qFormat="1"/>
-    <w:lsdException w:name="Bibliography" w:uiPriority="37" w:semiHidden="1" w:unhideWhenUsed="1"/>
-    <w:lsdException w:name="TOC Heading" w:uiPriority="39" w:semiHidden="1" w:unhideWhenUsed="1" w:qFormat="1"/>
+    <w:lsdException w:name="Bibliography" w:semiHidden="1" w:uiPriority="37" w:unhideWhenUsed="1"/>
+    <w:lsdException w:name="TOC Heading" w:semiHidden="1" w:uiPriority="39" w:unhideWhenUsed="1" w:qFormat="1"/>
     <w:lsdException w:name="Plain Table 1" w:uiPriority="41"/>
     <w:lsdException w:name="Plain Table 2" w:uiPriority="42"/>
     <w:lsdException w:name="Plain Table 3" w:uiPriority="43"/>
@@ -1654,39 +1730,25 @@
     <w:lsdException w:name="Unresolved Mention" w:semiHidden="1" w:unhideWhenUsed="1"/>
     <w:lsdException w:name="Smart Link" w:semiHidden="1" w:unhideWhenUsed="1"/>
   </w:latentStyles>
-  <w:style w:type="paragraph" w:styleId="Normal" w:default="1">
+  <w:style w:type="paragraph" w:default="1" w:styleId="Normal">
     <w:name w:val="Normal"/>
     <w:qFormat/>
     <w:pPr>
-      <w:widowControl/>
-      <w:suppressAutoHyphens w:val="true"/>
-      <w:bidi w:val="0"/>
-      <w:spacing w:before="0" w:after="0"/>
-      <w:jc w:val="start"/>
       <w:textAlignment w:val="baseline"/>
     </w:pPr>
-    <w:rPr>
-      <w:rFonts w:ascii="Liberation Serif" w:hAnsi="Liberation Serif" w:eastAsia="NSimSun" w:cs="Lucida Sans"/>
-      <w:color w:val="auto"/>
-      <w:kern w:val="2"/>
-      <w:sz w:val="24"/>
-      <w:szCs w:val="24"/>
-      <w:lang w:val="pt-BR" w:eastAsia="zh-CN" w:bidi="hi-IN"/>
-    </w:rPr>
-  </w:style>
-  <w:style w:type="paragraph" w:styleId="Heading1">
+  </w:style>
+  <w:style w:type="paragraph" w:styleId="Ttulo1">
     <w:name w:val="heading 1"/>
-    <w:basedOn w:val="Ttulo"/>
+    <w:basedOn w:val="Ttulo10"/>
     <w:uiPriority w:val="9"/>
     <w:qFormat/>
     <w:pPr>
       <w:outlineLvl w:val="0"/>
     </w:pPr>
-    <w:rPr/>
-  </w:style>
-  <w:style w:type="paragraph" w:styleId="Heading2">
+  </w:style>
+  <w:style w:type="paragraph" w:styleId="Ttulo2">
     <w:name w:val="heading 2"/>
-    <w:basedOn w:val="Ttulo"/>
+    <w:basedOn w:val="Ttulo10"/>
     <w:uiPriority w:val="9"/>
     <w:semiHidden/>
     <w:unhideWhenUsed/>
@@ -1694,11 +1756,10 @@
     <w:pPr>
       <w:outlineLvl w:val="1"/>
     </w:pPr>
-    <w:rPr/>
-  </w:style>
-  <w:style w:type="paragraph" w:styleId="Heading3">
+  </w:style>
+  <w:style w:type="paragraph" w:styleId="Ttulo3">
     <w:name w:val="heading 3"/>
-    <w:basedOn w:val="Ttulo"/>
+    <w:basedOn w:val="Ttulo10"/>
     <w:uiPriority w:val="9"/>
     <w:semiHidden/>
     <w:unhideWhenUsed/>
@@ -1706,68 +1767,82 @@
     <w:pPr>
       <w:outlineLvl w:val="2"/>
     </w:pPr>
-    <w:rPr/>
-  </w:style>
-  <w:style w:type="character" w:styleId="DefaultParagraphFont" w:default="1">
+  </w:style>
+  <w:style w:type="character" w:default="1" w:styleId="Fontepargpadro">
     <w:name w:val="Default Paragraph Font"/>
     <w:uiPriority w:val="1"/>
     <w:semiHidden/>
     <w:unhideWhenUsed/>
-    <w:qFormat/>
-    <w:rPr/>
-  </w:style>
-  <w:style w:type="character" w:styleId="FootnoteSymbol" w:customStyle="1">
+  </w:style>
+  <w:style w:type="table" w:default="1" w:styleId="Tabelanormal">
+    <w:name w:val="Normal Table"/>
+    <w:uiPriority w:val="99"/>
+    <w:semiHidden/>
+    <w:unhideWhenUsed/>
+    <w:tblPr>
+      <w:tblInd w:w="0" w:type="dxa"/>
+      <w:tblCellMar>
+        <w:top w:w="0" w:type="dxa"/>
+        <w:left w:w="108" w:type="dxa"/>
+        <w:bottom w:w="0" w:type="dxa"/>
+        <w:right w:w="108" w:type="dxa"/>
+      </w:tblCellMar>
+    </w:tblPr>
+  </w:style>
+  <w:style w:type="numbering" w:default="1" w:styleId="Semlista">
+    <w:name w:val="No List"/>
+    <w:uiPriority w:val="99"/>
+    <w:semiHidden/>
+    <w:unhideWhenUsed/>
+  </w:style>
+  <w:style w:type="character" w:customStyle="1" w:styleId="FootnoteSymbol">
     <w:name w:val="Footnote Symbol"/>
     <w:qFormat/>
-    <w:rPr/>
-  </w:style>
-  <w:style w:type="character" w:styleId="EndnoteSymbol" w:customStyle="1">
+  </w:style>
+  <w:style w:type="character" w:customStyle="1" w:styleId="EndnoteSymbol">
     <w:name w:val="Endnote Symbol"/>
     <w:qFormat/>
-    <w:rPr/>
-  </w:style>
-  <w:style w:type="character" w:styleId="Marcadores" w:customStyle="1">
+  </w:style>
+  <w:style w:type="character" w:customStyle="1" w:styleId="Marcadores">
     <w:name w:val="Marcadores"/>
     <w:qFormat/>
     <w:rPr>
-      <w:rFonts w:ascii="OpenSymbol" w:hAnsi="OpenSymbol" w:eastAsia="OpenSymbol" w:cs="OpenSymbol"/>
+      <w:rFonts w:ascii="OpenSymbol" w:eastAsia="OpenSymbol" w:hAnsi="OpenSymbol" w:cs="OpenSymbol"/>
     </w:rPr>
   </w:style>
-  <w:style w:type="character" w:styleId="Smbolosdenumerao" w:customStyle="1">
+  <w:style w:type="character" w:customStyle="1" w:styleId="Smbolosdenumerao">
     <w:name w:val="Símbolos de numeração"/>
     <w:qFormat/>
-    <w:rPr/>
-  </w:style>
-  <w:style w:type="character" w:styleId="WW8Num1z0" w:customStyle="1">
+  </w:style>
+  <w:style w:type="character" w:customStyle="1" w:styleId="WW8Num1z0">
     <w:name w:val="WW8Num1z0"/>
     <w:qFormat/>
     <w:rPr>
-      <w:rFonts w:ascii="Symbol" w:hAnsi="Symbol" w:eastAsia="Symbol" w:cs="OpenSymbol,"/>
+      <w:rFonts w:ascii="Symbol" w:eastAsia="Symbol" w:hAnsi="Symbol" w:cs="OpenSymbol,"/>
     </w:rPr>
   </w:style>
-  <w:style w:type="character" w:styleId="WW8Num1z1" w:customStyle="1">
+  <w:style w:type="character" w:customStyle="1" w:styleId="WW8Num1z1">
     <w:name w:val="WW8Num1z1"/>
     <w:qFormat/>
     <w:rPr>
-      <w:rFonts w:ascii="OpenSymbol," w:hAnsi="OpenSymbol," w:eastAsia="OpenSymbol," w:cs="OpenSymbol,"/>
+      <w:rFonts w:ascii="OpenSymbol," w:eastAsia="OpenSymbol," w:hAnsi="OpenSymbol," w:cs="OpenSymbol,"/>
     </w:rPr>
   </w:style>
-  <w:style w:type="character" w:styleId="TextodebaloChar" w:customStyle="1">
+  <w:style w:type="character" w:customStyle="1" w:styleId="TextodebaloChar">
     <w:name w:val="Texto de balão Char"/>
-    <w:basedOn w:val="DefaultParagraphFont"/>
+    <w:basedOn w:val="Fontepargpadro"/>
     <w:qFormat/>
     <w:rPr>
-      <w:rFonts w:ascii="Segoe UI" w:hAnsi="Segoe UI" w:eastAsia="Segoe UI" w:cs="Segoe UI"/>
+      <w:rFonts w:ascii="Segoe UI" w:eastAsia="Segoe UI" w:hAnsi="Segoe UI" w:cs="Segoe UI"/>
       <w:sz w:val="18"/>
       <w:szCs w:val="16"/>
     </w:rPr>
   </w:style>
-  <w:style w:type="character" w:styleId="EndnoteSymbol1" w:customStyle="1">
+  <w:style w:type="character" w:customStyle="1" w:styleId="EndnoteSymbol1">
     <w:name w:val="Endnote Symbol1"/>
     <w:qFormat/>
-    <w:rPr/>
-  </w:style>
-  <w:style w:type="character" w:styleId="VisitedInternetLink" w:customStyle="1">
+  </w:style>
+  <w:style w:type="character" w:customStyle="1" w:styleId="VisitedInternetLink">
     <w:name w:val="Visited Internet Link"/>
     <w:qFormat/>
     <w:rPr>
@@ -1775,7 +1850,7 @@
       <w:u w:val="single"/>
     </w:rPr>
   </w:style>
-  <w:style w:type="character" w:styleId="Internetlink" w:customStyle="1">
+  <w:style w:type="character" w:customStyle="1" w:styleId="Internetlink">
     <w:name w:val="Internet link"/>
     <w:qFormat/>
     <w:rPr>
@@ -1783,20 +1858,21 @@
       <w:u w:val="single"/>
     </w:rPr>
   </w:style>
-  <w:style w:type="character" w:styleId="EstiloDeEmail15" w:customStyle="1">
+  <w:style w:type="character" w:customStyle="1" w:styleId="EstiloDeEmail15">
     <w:name w:val="EstiloDeEmail15"/>
-    <w:basedOn w:val="DefaultParagraphFont"/>
+    <w:basedOn w:val="Fontepargpadro"/>
     <w:qFormat/>
     <w:rPr>
-      <w:rFonts w:ascii="Calibri" w:hAnsi="Calibri" w:eastAsia="Calibri" w:cs="Times New Roman"/>
+      <w:rFonts w:ascii="Calibri" w:eastAsia="Calibri" w:hAnsi="Calibri" w:cs="Times New Roman"/>
       <w:color w:val="auto"/>
       <w:sz w:val="22"/>
       <w:szCs w:val="22"/>
     </w:rPr>
   </w:style>
-  <w:style w:type="character" w:styleId="CabealhoChar" w:customStyle="1">
+  <w:style w:type="character" w:customStyle="1" w:styleId="CabealhoChar">
     <w:name w:val="Cabeçalho Char"/>
-    <w:basedOn w:val="DefaultParagraphFont"/>
+    <w:basedOn w:val="Fontepargpadro"/>
+    <w:link w:val="Cabealho"/>
     <w:uiPriority w:val="99"/>
     <w:qFormat/>
     <w:rsid w:val="00306821"/>
@@ -1805,9 +1881,10 @@
       <w:szCs w:val="21"/>
     </w:rPr>
   </w:style>
-  <w:style w:type="character" w:styleId="RodapChar" w:customStyle="1">
+  <w:style w:type="character" w:customStyle="1" w:styleId="RodapChar">
     <w:name w:val="Rodapé Char"/>
-    <w:basedOn w:val="DefaultParagraphFont"/>
+    <w:basedOn w:val="Fontepargpadro"/>
+    <w:link w:val="Rodap"/>
     <w:uiPriority w:val="99"/>
     <w:qFormat/>
     <w:rsid w:val="00306821"/>
@@ -1816,56 +1893,38 @@
       <w:szCs w:val="21"/>
     </w:rPr>
   </w:style>
-  <w:style w:type="paragraph" w:styleId="Ttulo" w:customStyle="1">
-    <w:name w:val="Título"/>
+  <w:style w:type="paragraph" w:customStyle="1" w:styleId="Ttulo10">
+    <w:name w:val="Título1"/>
     <w:next w:val="Textbody"/>
     <w:qFormat/>
     <w:pPr>
-      <w:keepNext w:val="true"/>
-      <w:widowControl/>
-      <w:suppressAutoHyphens w:val="true"/>
-      <w:bidi w:val="0"/>
+      <w:keepNext/>
       <w:spacing w:before="240" w:after="120"/>
-      <w:jc w:val="start"/>
       <w:textAlignment w:val="baseline"/>
     </w:pPr>
     <w:rPr>
-      <w:rFonts w:ascii="Arial" w:hAnsi="Arial" w:eastAsia="Microsoft YaHei" w:cs="Arial"/>
-      <w:color w:val="auto"/>
-      <w:kern w:val="2"/>
+      <w:rFonts w:ascii="Arial" w:eastAsia="Microsoft YaHei" w:hAnsi="Arial" w:cs="Arial"/>
       <w:sz w:val="28"/>
       <w:szCs w:val="28"/>
-      <w:lang w:val="pt-BR" w:eastAsia="zh-CN" w:bidi="hi-IN"/>
     </w:rPr>
   </w:style>
-  <w:style w:type="paragraph" w:styleId="BodyText">
+  <w:style w:type="paragraph" w:styleId="Corpodetexto">
     <w:name w:val="Body Text"/>
     <w:basedOn w:val="Normal"/>
     <w:pPr>
-      <w:spacing w:lineRule="auto" w:line="276" w:before="0" w:after="140"/>
+      <w:spacing w:after="140" w:line="276" w:lineRule="auto"/>
     </w:pPr>
-    <w:rPr/>
-  </w:style>
-  <w:style w:type="paragraph" w:styleId="List">
+  </w:style>
+  <w:style w:type="paragraph" w:styleId="Lista">
     <w:name w:val="List"/>
     <w:pPr>
-      <w:widowControl/>
-      <w:suppressAutoHyphens w:val="true"/>
-      <w:bidi w:val="0"/>
-      <w:spacing w:before="0" w:after="0"/>
-      <w:jc w:val="start"/>
       <w:textAlignment w:val="baseline"/>
     </w:pPr>
     <w:rPr>
-      <w:rFonts w:cs="Tahoma" w:ascii="Liberation Serif" w:hAnsi="Liberation Serif" w:eastAsia="NSimSun"/>
-      <w:color w:val="auto"/>
-      <w:kern w:val="2"/>
-      <w:sz w:val="24"/>
-      <w:szCs w:val="24"/>
-      <w:lang w:val="pt-BR" w:eastAsia="zh-CN" w:bidi="hi-IN"/>
+      <w:rFonts w:cs="Tahoma"/>
     </w:rPr>
   </w:style>
-  <w:style w:type="paragraph" w:styleId="Caption">
+  <w:style w:type="paragraph" w:styleId="Legenda">
     <w:name w:val="caption"/>
     <w:basedOn w:val="Standard1"/>
     <w:qFormat/>
@@ -1881,95 +1940,64 @@
       <w:szCs w:val="20"/>
     </w:rPr>
   </w:style>
-  <w:style w:type="paragraph" w:styleId="ndice" w:customStyle="1">
+  <w:style w:type="paragraph" w:customStyle="1" w:styleId="ndice">
     <w:name w:val="Índice"/>
     <w:qFormat/>
     <w:pPr>
-      <w:widowControl/>
       <w:suppressLineNumbers/>
-      <w:suppressAutoHyphens w:val="true"/>
-      <w:bidi w:val="0"/>
-      <w:spacing w:before="0" w:after="0"/>
-      <w:jc w:val="start"/>
       <w:textAlignment w:val="baseline"/>
     </w:pPr>
     <w:rPr>
-      <w:rFonts w:cs="Tahoma" w:ascii="Liberation Serif" w:hAnsi="Liberation Serif" w:eastAsia="NSimSun"/>
-      <w:color w:val="auto"/>
-      <w:kern w:val="2"/>
-      <w:sz w:val="24"/>
-      <w:szCs w:val="24"/>
-      <w:lang w:val="pt-BR" w:eastAsia="zh-CN" w:bidi="hi-IN"/>
+      <w:rFonts w:cs="Tahoma"/>
     </w:rPr>
   </w:style>
-  <w:style w:type="paragraph" w:styleId="Standard" w:customStyle="1">
+  <w:style w:type="paragraph" w:customStyle="1" w:styleId="Standard">
     <w:name w:val="Standard"/>
     <w:qFormat/>
     <w:pPr>
-      <w:widowControl/>
-      <w:suppressAutoHyphens w:val="true"/>
-      <w:bidi w:val="0"/>
-      <w:spacing w:before="0" w:after="0"/>
-      <w:jc w:val="start"/>
       <w:textAlignment w:val="baseline"/>
     </w:pPr>
     <w:rPr>
-      <w:rFonts w:ascii="Times New Roman" w:hAnsi="Times New Roman" w:eastAsia="SimSun" w:cs="Mangal"/>
+      <w:rFonts w:ascii="Times New Roman" w:eastAsia="SimSun" w:hAnsi="Times New Roman" w:cs="Mangal"/>
       <w:color w:val="00000A"/>
-      <w:kern w:val="2"/>
-      <w:sz w:val="24"/>
-      <w:szCs w:val="24"/>
-      <w:lang w:val="pt-BR" w:eastAsia="zh-CN" w:bidi="hi-IN"/>
     </w:rPr>
   </w:style>
-  <w:style w:type="paragraph" w:styleId="Textbody" w:customStyle="1">
+  <w:style w:type="paragraph" w:customStyle="1" w:styleId="Textbody">
     <w:name w:val="Text body"/>
     <w:basedOn w:val="Standard"/>
     <w:qFormat/>
     <w:pPr>
-      <w:spacing w:lineRule="auto" w:line="288" w:before="0" w:after="140"/>
+      <w:spacing w:after="140" w:line="288" w:lineRule="auto"/>
     </w:pPr>
-    <w:rPr/>
-  </w:style>
-  <w:style w:type="paragraph" w:styleId="Standard1" w:customStyle="1">
+  </w:style>
+  <w:style w:type="paragraph" w:customStyle="1" w:styleId="Standard1">
     <w:name w:val="Standard1"/>
     <w:qFormat/>
     <w:pPr>
-      <w:widowControl/>
-      <w:suppressAutoHyphens w:val="true"/>
-      <w:bidi w:val="0"/>
-      <w:spacing w:before="0" w:after="0"/>
-      <w:jc w:val="start"/>
       <w:textAlignment w:val="baseline"/>
     </w:pPr>
     <w:rPr>
-      <w:rFonts w:ascii="Times New Roman" w:hAnsi="Times New Roman" w:eastAsia="SimSun" w:cs="Mangal"/>
+      <w:rFonts w:ascii="Times New Roman" w:eastAsia="SimSun" w:hAnsi="Times New Roman" w:cs="Mangal"/>
       <w:color w:val="00000A"/>
-      <w:kern w:val="2"/>
-      <w:sz w:val="24"/>
-      <w:szCs w:val="24"/>
-      <w:lang w:val="pt-BR" w:eastAsia="zh-CN" w:bidi="hi-IN"/>
     </w:rPr>
   </w:style>
-  <w:style w:type="paragraph" w:styleId="Textbody1" w:customStyle="1">
+  <w:style w:type="paragraph" w:customStyle="1" w:styleId="Textbody1">
     <w:name w:val="Text body1"/>
     <w:basedOn w:val="Standard1"/>
     <w:qFormat/>
     <w:pPr>
-      <w:spacing w:before="0" w:after="120"/>
+      <w:spacing w:after="120"/>
     </w:pPr>
-    <w:rPr/>
-  </w:style>
-  <w:style w:type="paragraph" w:styleId="Contedodatabela" w:customStyle="1">
+  </w:style>
+  <w:style w:type="paragraph" w:customStyle="1" w:styleId="Contedodatabela">
     <w:name w:val="Conteúdo da tabela"/>
     <w:basedOn w:val="Standard1"/>
     <w:qFormat/>
     <w:pPr>
       <w:suppressLineNumbers/>
     </w:pPr>
-    <w:rPr/>
-  </w:style>
-  <w:style w:type="paragraph" w:styleId="Ttulodetabela" w:customStyle="1">
+  </w:style>
+  <w:style w:type="paragraph" w:customStyle="1" w:styleId="Ttulodetabela">
     <w:name w:val="Título de tabela"/>
     <w:basedOn w:val="Contedodatabela"/>
     <w:qFormat/>
@@ -1981,77 +2009,57 @@
       <w:bCs/>
     </w:rPr>
   </w:style>
-  <w:style w:type="paragraph" w:styleId="BalloonText">
+  <w:style w:type="paragraph" w:styleId="Textodebalo">
     <w:name w:val="Balloon Text"/>
     <w:basedOn w:val="Standard"/>
     <w:qFormat/>
-    <w:pPr/>
     <w:rPr>
-      <w:rFonts w:ascii="Segoe UI" w:hAnsi="Segoe UI" w:eastAsia="Segoe UI" w:cs="Segoe UI"/>
+      <w:rFonts w:ascii="Segoe UI" w:eastAsia="Segoe UI" w:hAnsi="Segoe UI" w:cs="Segoe UI"/>
       <w:sz w:val="18"/>
       <w:szCs w:val="16"/>
     </w:rPr>
   </w:style>
-  <w:style w:type="paragraph" w:styleId="Blocodecitao" w:customStyle="1">
+  <w:style w:type="paragraph" w:customStyle="1" w:styleId="Blocodecitao">
     <w:name w:val="Bloco de citação"/>
     <w:basedOn w:val="Standard"/>
     <w:qFormat/>
-    <w:pPr/>
-    <w:rPr/>
-  </w:style>
-  <w:style w:type="paragraph" w:styleId="Title">
+  </w:style>
+  <w:style w:type="paragraph" w:styleId="Ttulo">
     <w:name w:val="Title"/>
-    <w:basedOn w:val="Ttulo"/>
+    <w:basedOn w:val="Ttulo10"/>
     <w:uiPriority w:val="10"/>
     <w:qFormat/>
-    <w:pPr/>
-    <w:rPr/>
-  </w:style>
-  <w:style w:type="paragraph" w:styleId="Subtitle">
+  </w:style>
+  <w:style w:type="paragraph" w:styleId="Subttulo">
     <w:name w:val="Subtitle"/>
-    <w:basedOn w:val="Ttulo"/>
+    <w:basedOn w:val="Ttulo10"/>
     <w:uiPriority w:val="11"/>
     <w:qFormat/>
-    <w:pPr/>
-    <w:rPr/>
-  </w:style>
-  <w:style w:type="paragraph" w:styleId="Contedodalista" w:customStyle="1">
+  </w:style>
+  <w:style w:type="paragraph" w:customStyle="1" w:styleId="Contedodalista">
     <w:name w:val="Conteúdo da lista"/>
     <w:basedOn w:val="Standard"/>
     <w:qFormat/>
     <w:pPr>
-      <w:ind w:start="567"/>
+      <w:ind w:left="567"/>
     </w:pPr>
-    <w:rPr/>
-  </w:style>
-  <w:style w:type="paragraph" w:styleId="DocumentMap" w:customStyle="1">
+  </w:style>
+  <w:style w:type="paragraph" w:customStyle="1" w:styleId="DocumentMap">
     <w:name w:val="DocumentMap"/>
     <w:qFormat/>
-    <w:pPr>
-      <w:widowControl/>
-      <w:suppressAutoHyphens w:val="true"/>
-      <w:bidi w:val="0"/>
-      <w:spacing w:before="0" w:after="0"/>
-      <w:jc w:val="start"/>
-      <w:textAlignment w:val="auto"/>
-    </w:pPr>
     <w:rPr>
-      <w:rFonts w:ascii="Times New Roman" w:hAnsi="Times New Roman" w:eastAsia="Calibri" w:cs="Times New Roman"/>
-      <w:color w:val="auto"/>
-      <w:kern w:val="2"/>
+      <w:rFonts w:ascii="Times New Roman" w:eastAsia="Calibri" w:hAnsi="Times New Roman" w:cs="Times New Roman"/>
       <w:sz w:val="20"/>
       <w:szCs w:val="20"/>
-      <w:lang w:eastAsia="pt-BR" w:bidi="ar-SA" w:val="pt-BR"/>
+      <w:lang w:eastAsia="pt-BR" w:bidi="ar-SA"/>
     </w:rPr>
   </w:style>
-  <w:style w:type="paragraph" w:styleId="Cabealhoerodap">
+  <w:style w:type="paragraph" w:customStyle="1" w:styleId="Cabealhoerodap">
     <w:name w:val="Cabeçalho e rodapé"/>
     <w:basedOn w:val="Normal"/>
     <w:qFormat/>
-    <w:pPr/>
-    <w:rPr/>
-  </w:style>
-  <w:style w:type="paragraph" w:styleId="Header">
+  </w:style>
+  <w:style w:type="paragraph" w:styleId="Cabealho">
     <w:name w:val="header"/>
     <w:basedOn w:val="Normal"/>
     <w:link w:val="CabealhoChar"/>
@@ -2060,9 +2068,8 @@
     <w:rsid w:val="00306821"/>
     <w:pPr>
       <w:tabs>
-        <w:tab w:val="clear" w:pos="708"/>
-        <w:tab w:val="center" w:pos="4252" w:leader="none"/>
-        <w:tab w:val="right" w:pos="8504" w:leader="none"/>
+        <w:tab w:val="center" w:pos="4252"/>
+        <w:tab w:val="right" w:pos="8504"/>
       </w:tabs>
     </w:pPr>
     <w:rPr>
@@ -2070,7 +2077,7 @@
       <w:szCs w:val="21"/>
     </w:rPr>
   </w:style>
-  <w:style w:type="paragraph" w:styleId="Footer">
+  <w:style w:type="paragraph" w:styleId="Rodap">
     <w:name w:val="footer"/>
     <w:basedOn w:val="Normal"/>
     <w:link w:val="RodapChar"/>
@@ -2079,9 +2086,8 @@
     <w:rsid w:val="00306821"/>
     <w:pPr>
       <w:tabs>
-        <w:tab w:val="clear" w:pos="708"/>
-        <w:tab w:val="center" w:pos="4252" w:leader="none"/>
-        <w:tab w:val="right" w:pos="8504" w:leader="none"/>
+        <w:tab w:val="center" w:pos="4252"/>
+        <w:tab w:val="right" w:pos="8504"/>
       </w:tabs>
     </w:pPr>
     <w:rPr>
@@ -2096,59 +2102,51 @@
     <w:semiHidden/>
     <w:unhideWhenUsed/>
     <w:qFormat/>
-    <w:rsid w:val="00262cba"/>
+    <w:rsid w:val="00262CBA"/>
     <w:pPr>
-      <w:suppressAutoHyphens w:val="false"/>
+      <w:suppressAutoHyphens w:val="0"/>
       <w:spacing w:beforeAutospacing="1" w:afterAutospacing="1"/>
       <w:textAlignment w:val="auto"/>
     </w:pPr>
     <w:rPr>
-      <w:rFonts w:ascii="Times New Roman" w:hAnsi="Times New Roman" w:eastAsia="Times New Roman" w:cs="Times New Roman"/>
+      <w:rFonts w:ascii="Times New Roman" w:eastAsia="Times New Roman" w:hAnsi="Times New Roman" w:cs="Times New Roman"/>
       <w:kern w:val="0"/>
       <w:lang w:eastAsia="pt-BR" w:bidi="ar-SA"/>
     </w:rPr>
   </w:style>
-  <w:style w:type="paragraph" w:styleId="Contedodoquadro">
+  <w:style w:type="paragraph" w:customStyle="1" w:styleId="Contedodoquadro">
     <w:name w:val="Conteúdo do quadro"/>
     <w:basedOn w:val="Normal"/>
     <w:qFormat/>
-    <w:pPr/>
-    <w:rPr/>
-  </w:style>
-  <w:style w:type="numbering" w:styleId="Semlista" w:default="1">
-    <w:name w:val="Sem lista"/>
-    <w:uiPriority w:val="99"/>
-    <w:semiHidden/>
-    <w:unhideWhenUsed/>
-    <w:qFormat/>
-  </w:style>
-  <w:style w:type="numbering" w:styleId="Semlista1" w:customStyle="1">
+  </w:style>
+  <w:style w:type="numbering" w:customStyle="1" w:styleId="Semlista1">
     <w:name w:val="Sem lista1"/>
     <w:qFormat/>
   </w:style>
-  <w:style w:type="numbering" w:styleId="WW8Num1" w:customStyle="1">
+  <w:style w:type="numbering" w:customStyle="1" w:styleId="WW8Num1">
     <w:name w:val="WW8Num1"/>
     <w:qFormat/>
   </w:style>
-  <w:style w:type="table" w:default="1" w:styleId="Tabelanormal">
-    <w:name w:val="Normal Table"/>
-    <w:uiPriority w:val="99"/>
-    <w:semiHidden/>
-    <w:unhideWhenUsed/>
-    <w:tblPr>
-      <w:tblCellMar>
-        <w:top w:w="0" w:type="dxa"/>
-        <w:left w:w="108" w:type="dxa"/>
-        <w:bottom w:w="0" w:type="dxa"/>
-        <w:right w:w="108" w:type="dxa"/>
-      </w:tblCellMar>
-    </w:tblPr>
+  <w:style w:type="paragraph" w:styleId="PargrafodaLista">
+    <w:name w:val="List Paragraph"/>
+    <w:basedOn w:val="Normal"/>
+    <w:uiPriority w:val="34"/>
+    <w:qFormat/>
+    <w:rsid w:val="007A35C9"/>
+    <w:pPr>
+      <w:ind w:left="720"/>
+      <w:contextualSpacing/>
+    </w:pPr>
+    <w:rPr>
+      <w:rFonts w:cs="Mangal"/>
+      <w:szCs w:val="21"/>
+    </w:rPr>
   </w:style>
 </w:styles>
 </file>
 
 <file path=word/theme/theme1.xml><?xml version="1.0" encoding="utf-8"?>
-<a:theme xmlns:a="http://schemas.openxmlformats.org/drawingml/2006/main" xmlns:r="http://schemas.openxmlformats.org/officeDocument/2006/relationships" name="Tema do Office">
+<a:theme xmlns:a="http://schemas.openxmlformats.org/drawingml/2006/main" name="Tema do Office">
   <a:themeElements>
     <a:clrScheme name="Office">
       <a:dk1>
@@ -2190,12 +2188,12 @@
     </a:clrScheme>
     <a:fontScheme name="Office">
       <a:majorFont>
-        <a:latin typeface="Calibri Light" panose="020F0302020204030204" pitchFamily="0" charset="1"/>
+        <a:latin typeface="Calibri Light" panose="020F0302020204030204"/>
         <a:ea typeface=""/>
         <a:cs typeface=""/>
       </a:majorFont>
       <a:minorFont>
-        <a:latin typeface="Calibri" panose="020F0502020204030204" pitchFamily="0" charset="1"/>
+        <a:latin typeface="Calibri" panose="020F0502020204030204"/>
         <a:ea typeface=""/>
         <a:cs typeface=""/>
       </a:minorFont>
@@ -2227,7 +2225,7 @@
             </a:gs>
           </a:gsLst>
           <a:lin ang="5400000" scaled="0"/>
-          <a:tileRect l="0" t="0" r="0" b="0"/>
+          <a:tileRect/>
         </a:gradFill>
         <a:gradFill>
           <a:gsLst>
@@ -2251,7 +2249,7 @@
             </a:gs>
           </a:gsLst>
           <a:lin ang="5400000" scaled="0"/>
-          <a:tileRect l="0" t="0" r="0" b="0"/>
+          <a:tileRect/>
         </a:gradFill>
       </a:fillStyleLst>
       <a:lnStyleLst>
@@ -2311,11 +2309,13 @@
             </a:gs>
           </a:gsLst>
           <a:lin ang="5400000" scaled="0"/>
-          <a:tileRect l="0" t="0" r="0" b="0"/>
+          <a:tileRect/>
         </a:gradFill>
       </a:bgFillStyleLst>
     </a:fmtScheme>
   </a:themeElements>
+  <a:objectDefaults/>
+  <a:extraClrSchemeLst/>
 </a:theme>
 </file>
 

</xml_diff>